<commit_message>
docs(governance): amend Document 05 to v0.2.1 reconciling Phase P6 scope and PAR authorization
</commit_message>
<xml_diff>
--- a/docs/ClassroomIQ_Document_05_Implementation_Roadmap_and_Build_Authorization_v0.2.0.docx
+++ b/docs/ClassroomIQ_Document_05_Implementation_Roadmap_and_Build_Authorization_v0.2.0.docx
@@ -286,19 +286,8 @@
             <w:shd w:fill="F2F6F9"/>
           </w:tcPr>
           <w:p>
-            <w:pPr>
-              <w:pStyle w:val="TableText"/>
-            </w:pPr>
-            <w:r>
-              <w:t>0.2.0</w:t>
-            </w:r>
-            <w:r>
-              <w:rPr>
-                <w:rFonts w:ascii="Aptos" w:hAnsi="Aptos"/>
-                <w:b w:val="0"/>
-                <w:color w:val="17242E"/>
-                <w:sz w:val="16"/>
-              </w:rPr>
+            <w:r>
+              <w:t>0.2.1</w:t>
             </w:r>
           </w:p>
         </w:tc>
@@ -407,19 +396,8 @@
             <w:shd w:fill="F2F6F9"/>
           </w:tcPr>
           <w:p>
-            <w:pPr>
-              <w:pStyle w:val="TableText"/>
-            </w:pPr>
-            <w:r>
-              <w:t>CONTROLLED DRAFT — DATASETS PRESENT; VALIDATION AND BUILD AUTHORIZATION PENDING</w:t>
-            </w:r>
-            <w:r>
-              <w:rPr>
-                <w:rFonts w:ascii="Aptos" w:hAnsi="Aptos"/>
-                <w:b w:val="0"/>
-                <w:color w:val="17242E"/>
-                <w:sz w:val="16"/>
-              </w:rPr>
+            <w:r>
+              <w:t>CONTROLLED DRAFT — PHASE P6 AUTHORIZED (PAR-CIQ-P6-20261009-01)</w:t>
             </w:r>
           </w:p>
         </w:tc>
@@ -589,18 +567,8 @@
             </w:tcMar>
           </w:tcPr>
           <w:p>
-            <w:pPr>
-              <w:pStyle w:val="TableText"/>
-            </w:pPr>
-            <w:r/>
-            <w:r>
-              <w:rPr>
-                <w:rFonts w:ascii="Aptos" w:hAnsi="Aptos"/>
-                <w:b w:val="0"/>
-                <w:color w:val="17242E"/>
-                <w:sz w:val="16"/>
-              </w:rPr>
-              <w:t>NOT GRANTED</w:t>
+            <w:r>
+              <w:t>PHASE P6 AUTHORIZED (PAR-CIQ-P6-20261009-01)</w:t>
             </w:r>
           </w:p>
         </w:tc>
@@ -709,18 +677,8 @@
             </w:tcMar>
           </w:tcPr>
           <w:p>
-            <w:pPr>
-              <w:pStyle w:val="TableText"/>
-            </w:pPr>
-            <w:r/>
-            <w:r>
-              <w:rPr>
-                <w:rFonts w:ascii="Aptos" w:hAnsi="Aptos"/>
-                <w:b w:val="0"/>
-                <w:color w:val="17242E"/>
-                <w:sz w:val="16"/>
-              </w:rPr>
-              <w:t>PENDING — record exact repository, branch and commit before first authorized change</w:t>
+            <w:r>
+              <w:t>D:\Projects\CommitCon (branch: feature/phase-p6-optimization-and-simulation, baseline commit: 6ba80fc)</w:t>
             </w:r>
           </w:p>
         </w:tc>
@@ -5236,18 +5194,8 @@
             </w:tcMar>
           </w:tcPr>
           <w:p>
-            <w:pPr>
-              <w:pStyle w:val="TableText"/>
-            </w:pPr>
-            <w:r/>
-            <w:r>
-              <w:rPr>
-                <w:rFonts w:ascii="Aptos" w:hAnsi="Aptos"/>
-                <w:b w:val="0"/>
-                <w:color w:val="17242E"/>
-                <w:sz w:val="13"/>
-              </w:rPr>
-              <w:t>Controlled dynamic simulation</w:t>
+            <w:r>
+              <w:t>Optimization Engine &amp; Controlled Dynamic Simulation</w:t>
             </w:r>
           </w:p>
         </w:tc>
@@ -5263,18 +5211,8 @@
             </w:tcMar>
           </w:tcPr>
           <w:p>
-            <w:pPr>
-              <w:pStyle w:val="TableText"/>
-            </w:pPr>
-            <w:r/>
-            <w:r>
-              <w:rPr>
-                <w:rFonts w:ascii="Aptos" w:hAnsi="Aptos"/>
-                <w:b w:val="0"/>
-                <w:color w:val="17242E"/>
-                <w:sz w:val="13"/>
-              </w:rPr>
-              <w:t>Implement approved event contract, state versioning, atomicity, affected-set, bounded repair and history/diff.</w:t>
+            <w:r>
+              <w:t>Implement OR-Tools CP-SAT optimization engine for walking-distance minimization, metric evaluation suite (T_walk, room affinity, D_repair), approved dynamic event lifecycle controller (events.csv), and bounded affected-set repair.</w:t>
             </w:r>
           </w:p>
         </w:tc>
@@ -5290,18 +5228,8 @@
             </w:tcMar>
           </w:tcPr>
           <w:p>
-            <w:pPr>
-              <w:pStyle w:val="TableText"/>
-            </w:pPr>
-            <w:r/>
-            <w:r>
-              <w:rPr>
-                <w:rFonts w:ascii="Aptos" w:hAnsi="Aptos"/>
-                <w:b w:val="0"/>
-                <w:color w:val="17242E"/>
-                <w:sz w:val="13"/>
-              </w:rPr>
-              <w:t>SC-05–SC-13 and related limit/rollback tests.</w:t>
+            <w:r>
+              <w:t>Independent validation pass on optimizer candidates; measurable T_walk improvement over greedy baseline; valid event recovery with &lt;= 2 unaffected session reassignments; zero frontend or REST development.</w:t>
             </w:r>
           </w:p>
         </w:tc>
@@ -5317,18 +5245,8 @@
             </w:tcMar>
           </w:tcPr>
           <w:p>
-            <w:pPr>
-              <w:pStyle w:val="TableText"/>
-            </w:pPr>
-            <w:r/>
-            <w:r>
-              <w:rPr>
-                <w:rFonts w:ascii="Aptos" w:hAnsi="Aptos"/>
-                <w:b w:val="0"/>
-                <w:color w:val="17242E"/>
-                <w:sz w:val="13"/>
-              </w:rPr>
-              <w:t>Boundary + data contracts + P6 order</w:t>
+            <w:r>
+              <w:t>Boundary + data contracts + PAR-CIQ-P6-20261009-01</w:t>
             </w:r>
           </w:p>
         </w:tc>
@@ -9213,13 +9131,13 @@
         <w:pStyle w:val="Heading2"/>
       </w:pPr>
       <w:r>
-        <w:t>P6 — Controlled dynamic simulation</w:t>
+        <w:t>P6 — Optimization Engine &amp; Controlled Dynamic Simulation</w:t>
       </w:r>
     </w:p>
     <w:p>
       <w:pPr/>
       <w:r>
-        <w:t>Purpose: Add approved event application and bounded reallocation without corrupting historical publication or silently expanding limits.</w:t>
+        <w:t>Purpose: Establish the mathematical optimization core, metric evaluation suite, and dynamic disruption recovery engine: 1. Formulate room-session allocation as an exact Constraint Programming / Mixed-Integer model (OR-Tools CP-SAT) enforcing hard constraints and minimizing cohort walking time. 2. Implement standardized metric evaluators for cohort walking distance (T_walk), room specialization affinity, and disruption reassignment penalty (D_repair). 3. Implement the dynamic event controller executing the 5 simulation scenarios from events.csv, determining affected session sets atomically, and executing bounded repair that minimizes ripple disruptions. 4. Enforce strict boundaries: all candidates verified independently by IndependentValidator; zero modifications to source CSVs; zero frontend or REST endpoint development (deferred to P7).</w:t>
       </w:r>
     </w:p>
     <w:tbl>
@@ -25292,6 +25210,48 @@
           </w:p>
         </w:tc>
       </w:tr>
+      <w:tr>
+        <w:tc>
+          <w:tcPr>
+            <w:tcW w:type="dxa" w:w="2459"/>
+          </w:tcPr>
+          <w:p>
+            <w:r>
+              <w:t>0.2.1</w:t>
+            </w:r>
+          </w:p>
+        </w:tc>
+        <w:tc>
+          <w:tcPr>
+            <w:tcW w:type="dxa" w:w="2459"/>
+          </w:tcPr>
+          <w:p>
+            <w:r>
+              <w:t>2026-10-09</w:t>
+            </w:r>
+          </w:p>
+        </w:tc>
+        <w:tc>
+          <w:tcPr>
+            <w:tcW w:type="dxa" w:w="2459"/>
+          </w:tcPr>
+          <w:p>
+            <w:r>
+              <w:t>Reconciled Phase P6 scope to unify OR-Tools CP-SAT optimization, metric evaluation suite, and controlled dynamic simulation prior to P7 UI integration. Repository baseline recorded at commit 6ba80fc. Phase P6 build authorization granted under PAR-CIQ-P6-20261009-01.</w:t>
+            </w:r>
+          </w:p>
+        </w:tc>
+        <w:tc>
+          <w:tcPr>
+            <w:tcW w:type="dxa" w:w="2459"/>
+          </w:tcPr>
+          <w:p>
+            <w:r>
+              <w:t>CONTROLLED DRAFT — PHASE P6 AUTHORIZED</w:t>
+            </w:r>
+          </w:p>
+        </w:tc>
+      </w:tr>
     </w:tbl>
     <w:p>
       <w:pPr>
@@ -26710,7 +26670,7 @@
     <w:p>
       <w:pPr/>
       <w:r>
-        <w:t>No build authorization is granted by CIQ-PLAN-005 v0.2.0.</w:t>
+        <w:t>Phase P6 build authorization is granted under PAR-CIQ-P6-20261009-01 (CIQ-PLAN-005 v0.2.1).</w:t>
       </w:r>
     </w:p>
     <w:sectPr>

</xml_diff>

<commit_message>
fix(p6): formulate direct walking-time objective, add hand-calculated tests, and resolve M601 closure acceptance gap
</commit_message>
<xml_diff>
--- a/docs/ClassroomIQ_Document_05_Implementation_Roadmap_and_Build_Authorization_v0.2.0.docx
+++ b/docs/ClassroomIQ_Document_05_Implementation_Roadmap_and_Build_Authorization_v0.2.0.docx
@@ -287,7 +287,7 @@
           </w:tcPr>
           <w:p>
             <w:r>
-              <w:t>0.2.1</w:t>
+              <w:t>0.2.2</w:t>
             </w:r>
           </w:p>
         </w:tc>
@@ -397,7 +397,7 @@
           </w:tcPr>
           <w:p>
             <w:r>
-              <w:t>CONTROLLED DRAFT — PHASE P6 AUTHORIZED (PAR-CIQ-P6-20261009-01)</w:t>
+              <w:t>CONTROLLED DRAFT — PHASE P6 ACCEPTANCE REVIEW &amp; CLARIFICATION (PAR-CIQ-P6-20261009-01)</w:t>
             </w:r>
           </w:p>
         </w:tc>
@@ -9504,18 +9504,8 @@
             </w:tcMar>
           </w:tcPr>
           <w:p>
-            <w:pPr>
-              <w:pStyle w:val="TableText"/>
-            </w:pPr>
-            <w:r/>
-            <w:r>
-              <w:rPr>
-                <w:rFonts w:ascii="Aptos" w:hAnsi="Aptos"/>
-                <w:b w:val="0"/>
-                <w:color w:val="17242E"/>
-                <w:sz w:val="14"/>
-              </w:rPr>
-              <w:t>SC-05–SC-13, SC-18; closure with/without feasible alternate; invalid target; duplicates; boundary limits; ordering; cancellation/timeout; stale snapshot.</w:t>
+            <w:r>
+              <w:t>SC-05..SC-13, SC-18; closure with feasible alternate (EVT-DEMO-003..005, EVT-SYNTH-CLOSURE-FEASIBLE) and without feasible alternate (EVT-DEMO-001 M601 closure truthfully diagnosed as capacity exhaustion under 100% concurrent lab saturation); invalid target; duplicates; boundary limits; ordering; cancellation/timeout; stale snapshot.</w:t>
             </w:r>
           </w:p>
         </w:tc>
@@ -9565,18 +9555,8 @@
             <w:shd w:fill="F2F6F9"/>
           </w:tcPr>
           <w:p>
-            <w:pPr>
-              <w:pStyle w:val="TableText"/>
-            </w:pPr>
-            <w:r/>
-            <w:r>
-              <w:rPr>
-                <w:rFonts w:ascii="Aptos" w:hAnsi="Aptos"/>
-                <w:b w:val="0"/>
-                <w:color w:val="17242E"/>
-                <w:sz w:val="14"/>
-              </w:rPr>
-              <w:t>All authorized events have deterministic documented terminal outcomes; failed repair is distinguished from event-application failure; previous valid/published state remains recoverable per approved rules.</w:t>
+            <w:r>
+              <w:t>All authorized events have deterministic documented terminal outcomes; infeasible repair (EVT-DEMO-001) is truthfully distinguished from execution failure and from successful recovery (EVT-DEMO-003..005, EVT-SYNTH-CLOSURE-FEASIBLE); previous valid state remains recoverable via atomic rollback.</w:t>
             </w:r>
           </w:p>
         </w:tc>
@@ -25248,6 +25228,48 @@
           <w:p>
             <w:r>
               <w:t>CONTROLLED DRAFT — PHASE P6 AUTHORIZED</w:t>
+            </w:r>
+          </w:p>
+        </w:tc>
+      </w:tr>
+      <w:tr>
+        <w:tc>
+          <w:tcPr>
+            <w:tcW w:type="dxa" w:w="2459"/>
+          </w:tcPr>
+          <w:p>
+            <w:r>
+              <w:t>0.2.2</w:t>
+            </w:r>
+          </w:p>
+        </w:tc>
+        <w:tc>
+          <w:tcPr>
+            <w:tcW w:type="dxa" w:w="2459"/>
+          </w:tcPr>
+          <w:p>
+            <w:r>
+              <w:t>2026-10-09</w:t>
+            </w:r>
+          </w:p>
+        </w:tc>
+        <w:tc>
+          <w:tcPr>
+            <w:tcW w:type="dxa" w:w="2459"/>
+          </w:tcPr>
+          <w:p>
+            <w:r>
+              <w:t>Phase P6 Acceptance Review &amp; Targeted Corrections: (1) Formulated CP-SAT walking-time objective to directly minimize TravelMatrixService symmetric travel times (distinguishing 0 min, 3 min, 8 min transitions); (2) Verified mathematical infeasibility of EVT-DEMO-001 (100% concurrent lab saturation on campus) and clarified that truthful infeasible_repair diagnosis satisfies acceptance; (3) Added separate synthetic test fixture EVT-SYNTH-CLOSURE-FEASIBLE demonstrating successful recovery with 0 unaffected reassignments (&lt;= 2 ripple limit); (4) Verified all 42 tests pass with independent validation.</w:t>
+            </w:r>
+          </w:p>
+        </w:tc>
+        <w:tc>
+          <w:tcPr>
+            <w:tcW w:type="dxa" w:w="2459"/>
+          </w:tcPr>
+          <w:p>
+            <w:r>
+              <w:t>CONTROLLED DRAFT — PHASE P6 ACCEPTANCE REVIEW &amp; CLARIFICATION</w:t>
             </w:r>
           </w:p>
         </w:tc>

</xml_diff>

<commit_message>
docs(governance): amend Document 05 to v0.2.3 recording Phase P6 acceptance with documented odd-cycle limitation
</commit_message>
<xml_diff>
--- a/docs/ClassroomIQ_Document_05_Implementation_Roadmap_and_Build_Authorization_v0.2.0.docx
+++ b/docs/ClassroomIQ_Document_05_Implementation_Roadmap_and_Build_Authorization_v0.2.0.docx
@@ -287,7 +287,7 @@
           </w:tcPr>
           <w:p>
             <w:r>
-              <w:t>0.2.2</w:t>
+              <w:t>0.2.3</w:t>
             </w:r>
           </w:p>
         </w:tc>
@@ -335,18 +335,8 @@
             </w:tcMar>
           </w:tcPr>
           <w:p>
-            <w:pPr>
-              <w:pStyle w:val="TableText"/>
-            </w:pPr>
-            <w:r/>
-            <w:r>
-              <w:rPr>
-                <w:rFonts w:ascii="Aptos" w:hAnsi="Aptos"/>
-                <w:b w:val="0"/>
-                <w:color w:val="17242E"/>
-                <w:sz w:val="16"/>
-              </w:rPr>
-              <w:t>2026-10-09</w:t>
+            <w:r>
+              <w:t>2026-10-10</w:t>
             </w:r>
           </w:p>
         </w:tc>
@@ -397,7 +387,7 @@
           </w:tcPr>
           <w:p>
             <w:r>
-              <w:t>CONTROLLED DRAFT — PHASE P6 ACCEPTANCE REVIEW &amp; CLARIFICATION (PAR-CIQ-P6-20261009-01)</w:t>
+              <w:t>PHASE P6 ACCEPTED WITH DOCUMENTED ODD-CYCLE OPTIMIZATION LIMITATION (PAR-CIQ-P6-20261009-01)</w:t>
             </w:r>
           </w:p>
         </w:tc>
@@ -568,7 +558,7 @@
           </w:tcPr>
           <w:p>
             <w:r>
-              <w:t>PHASE P6 AUTHORIZED (PAR-CIQ-P6-20261009-01)</w:t>
+              <w:t>PHASE P6 ACCEPTED (ODD-CYCLE LIMITATION DOCUMENTED)</w:t>
             </w:r>
           </w:p>
         </w:tc>
@@ -3135,18 +3125,8 @@
             </w:tcMar>
           </w:tcPr>
           <w:p>
-            <w:pPr>
-              <w:pStyle w:val="TableText"/>
-            </w:pPr>
-            <w:r/>
-            <w:r>
-              <w:rPr>
-                <w:rFonts w:ascii="Aptos" w:hAnsi="Aptos"/>
-                <w:b w:val="0"/>
-                <w:color w:val="17242E"/>
-                <w:sz w:val="14"/>
-              </w:rPr>
-              <w:t>NOT STARTED</w:t>
+            <w:r>
+              <w:t>PHASE P6 ACCEPTED (PAR-CIQ-P6-20261009-01) with documented odd-cycle limitation; G7/P7 ungranted.</w:t>
             </w:r>
           </w:p>
         </w:tc>
@@ -3162,18 +3142,8 @@
             </w:tcMar>
           </w:tcPr>
           <w:p>
-            <w:pPr>
-              <w:pStyle w:val="TableText"/>
-            </w:pPr>
-            <w:r/>
-            <w:r>
-              <w:rPr>
-                <w:rFonts w:ascii="Aptos" w:hAnsi="Aptos"/>
-                <w:b w:val="0"/>
-                <w:color w:val="17242E"/>
-                <w:sz w:val="14"/>
-              </w:rPr>
-              <w:t>Not applicable before first authorized phase.</w:t>
+            <w:r>
+              <w:t>Next phase remains subject to separate authorization.</w:t>
             </w:r>
           </w:p>
         </w:tc>
@@ -5229,7 +5199,7 @@
           </w:tcPr>
           <w:p>
             <w:r>
-              <w:t>Independent validation pass on optimizer candidates; measurable T_walk improvement over greedy baseline; valid event recovery with &lt;= 2 unaffected session reassignments; zero frontend or REST development.</w:t>
+              <w:t>Independent validation pass on all candidate allocations (VALID_COMPLETE); demonstrated walking-distance reduction (&gt;= 50% on even cycle, hand-calculated benchmarks); baseline protection fallback on time-limited non-improving instances (Odd cycle retained baseline truthfully reported); CP-SAT solver search time &lt;= 10.0s, total end-to-end comparison latency &lt;= 12.0s; valid event recovery with &lt;= 2 unaffected session reassignments on feasible disruptions; truthful diagnosis of saturated infeasibility (EVT-DEMO-001); zero frontend or REST development.</w:t>
             </w:r>
           </w:p>
         </w:tc>
@@ -9556,7 +9526,7 @@
           </w:tcPr>
           <w:p>
             <w:r>
-              <w:t>All authorized events have deterministic documented terminal outcomes; infeasible repair (EVT-DEMO-001) is truthfully distinguished from execution failure and from successful recovery (EVT-DEMO-003..005, EVT-SYNTH-CLOSURE-FEASIBLE); previous valid state remains recoverable via atomic rollback.</w:t>
+              <w:t>All authorized events have deterministic documented terminal outcomes; infeasible repair (EVT-DEMO-001) is truthfully distinguished from execution failure and from successful recovery (EVT-DEMO-003..005, EVT-SYNTH-CLOSURE-FEASIBLE); previous valid state remains recoverable via atomic rollback; Even cycle demonstrates 60.52% walking-time reduction; Odd cycle retains valid baseline under baseline protection fallback when solver halts at FEASIBLE within search limit; total pipeline comparison latency &lt;= 12.0s.</w:t>
             </w:r>
           </w:p>
         </w:tc>
@@ -25274,6 +25244,48 @@
           </w:p>
         </w:tc>
       </w:tr>
+      <w:tr>
+        <w:tc>
+          <w:tcPr>
+            <w:tcW w:type="dxa" w:w="2459"/>
+          </w:tcPr>
+          <w:p>
+            <w:r>
+              <w:t>0.2.3</w:t>
+            </w:r>
+          </w:p>
+        </w:tc>
+        <w:tc>
+          <w:tcPr>
+            <w:tcW w:type="dxa" w:w="2459"/>
+          </w:tcPr>
+          <w:p>
+            <w:r>
+              <w:t>2026-10-10</w:t>
+            </w:r>
+          </w:p>
+        </w:tc>
+        <w:tc>
+          <w:tcPr>
+            <w:tcW w:type="dxa" w:w="2459"/>
+          </w:tcPr>
+          <w:p>
+            <w:r>
+              <w:t>Phase P6 Accepted with Documented Odd-Cycle Optimization Limitation: (1) Approved P6 acceptance clarification: verified 60.52% walking-time reduction on even cycle; (2) Formally recorded odd-cycle limitation where CP-SAT search halts at FEASIBLE within solver limit without beating greedy baseline, triggering baseline protection fallback to retain valid baseline (1,248.0 min) without false improvement claims; (3) Codified runtime standard: CP-SAT solver search limit &lt;= 10.0s, composite end-to-end comparison pipeline latency &lt;= 12.0s (measured odd cycle comparison: 10.017s); (4) Verified all 45 automated tests pass, 7 source CSVs bit-for-bit unchanged, zero frontend/REST code; (5) Phase P6 formally accepted; Phase P7 remains unauthorized.</w:t>
+            </w:r>
+          </w:p>
+        </w:tc>
+        <w:tc>
+          <w:tcPr>
+            <w:tcW w:type="dxa" w:w="2459"/>
+          </w:tcPr>
+          <w:p>
+            <w:r>
+              <w:t>PHASE P6 ACCEPTED (ODD-CYCLE LIMITATION DOCUMENTED)</w:t>
+            </w:r>
+          </w:p>
+        </w:tc>
+      </w:tr>
     </w:tbl>
     <w:p>
       <w:pPr>
@@ -26692,7 +26704,7 @@
     <w:p>
       <w:pPr/>
       <w:r>
-        <w:t>Phase P6 build authorization is granted under PAR-CIQ-P6-20261009-01 (CIQ-PLAN-005 v0.2.1).</w:t>
+        <w:t>Phase P6 build authorization is granted under PAR-CIQ-P6-20261009-01 (CIQ-PLAN-005 v0.2.1) and formally accepted at v0.2.3 with documented odd-cycle optimization limitation.</w:t>
       </w:r>
     </w:p>
     <w:sectPr>

</xml_diff>

<commit_message>
docs(governance): amend Document 05 to v0.2.4 with Phase P7 Phase Authorization Record (PAR-CIQ-P7-20261010-01)
</commit_message>
<xml_diff>
--- a/docs/ClassroomIQ_Document_05_Implementation_Roadmap_and_Build_Authorization_v0.2.0.docx
+++ b/docs/ClassroomIQ_Document_05_Implementation_Roadmap_and_Build_Authorization_v0.2.0.docx
@@ -287,7 +287,7 @@
           </w:tcPr>
           <w:p>
             <w:r>
-              <w:t>0.2.3</w:t>
+              <w:t>0.2.4</w:t>
             </w:r>
           </w:p>
         </w:tc>
@@ -387,7 +387,7 @@
           </w:tcPr>
           <w:p>
             <w:r>
-              <w:t>PHASE P6 ACCEPTED WITH DOCUMENTED ODD-CYCLE OPTIMIZATION LIMITATION (PAR-CIQ-P6-20261009-01)</w:t>
+              <w:t>CONTROLLED DRAFT — PHASE P7 FRONTEND INTEGRATION AUTHORIZATION PREPARATION (PAR-CIQ-P7-20261010-01)</w:t>
             </w:r>
           </w:p>
         </w:tc>
@@ -558,7 +558,7 @@
           </w:tcPr>
           <w:p>
             <w:r>
-              <w:t>PHASE P6 ACCEPTED (ODD-CYCLE LIMITATION DOCUMENTED)</w:t>
+              <w:t>PHASE P7 AUTHORIZATION PREPARED (PENDING OWNER APPROVAL)</w:t>
             </w:r>
           </w:p>
         </w:tc>
@@ -668,7 +668,7 @@
           </w:tcPr>
           <w:p>
             <w:r>
-              <w:t>D:\Projects\CommitCon (branch: feature/phase-p6-optimization-and-simulation, baseline commit: 6ba80fc)</w:t>
+              <w:t>D:\Projects\CommitCon (branch: feature/phase-p6-optimization-and-simulation, baseline commit: 9f6fea2)</w:t>
             </w:r>
           </w:p>
         </w:tc>
@@ -3126,7 +3126,7 @@
           </w:tcPr>
           <w:p>
             <w:r>
-              <w:t>PHASE P6 ACCEPTED (PAR-CIQ-P6-20261009-01) with documented odd-cycle limitation; G7/P7 ungranted.</w:t>
+              <w:t>PHASE P6 ACCEPTED (v0.2.3); G7 (Phase P7 Frontend Integration) Authorization Prepared under PAR-CIQ-P7-20261010-01 pending owner review and explicit approval.</w:t>
             </w:r>
           </w:p>
         </w:tc>
@@ -5266,18 +5266,8 @@
             <w:shd w:fill="F2F6F9"/>
           </w:tcPr>
           <w:p>
-            <w:pPr>
-              <w:pStyle w:val="TableText"/>
-            </w:pPr>
-            <w:r/>
-            <w:r>
-              <w:rPr>
-                <w:rFonts w:ascii="Aptos" w:hAnsi="Aptos"/>
-                <w:b w:val="0"/>
-                <w:color w:val="17242E"/>
-                <w:sz w:val="13"/>
-              </w:rPr>
-              <w:t>UI integration and reporting</w:t>
+            <w:r>
+              <w:t>Frontend Integration, REST API Bridge &amp; UI Benchmark Realization</w:t>
             </w:r>
           </w:p>
         </w:tc>
@@ -5294,18 +5284,8 @@
             <w:shd w:fill="F2F6F9"/>
           </w:tcPr>
           <w:p>
-            <w:pPr>
-              <w:pStyle w:val="TableText"/>
-            </w:pPr>
-            <w:r/>
-            <w:r>
-              <w:rPr>
-                <w:rFonts w:ascii="Aptos" w:hAnsi="Aptos"/>
-                <w:b w:val="0"/>
-                <w:color w:val="17242E"/>
-                <w:sz w:val="13"/>
-              </w:rPr>
-              <w:t>Connect approved workspaces to real backend results and expose status/explanations/empty/error/partial states.</w:t>
+            <w:r>
+              <w:t>Implement FastAPI REST integration layer and modern zero-build Vanilla SPA frontend (HTML5/CSS3/ES6+) providing 5 unified views: Operations Dashboard, Timetable Grid (Odd 593 / Even 570 sessions, Room 86/70 filter, Cohort filter), Allocation Studio (side-by-side Baseline vs CP-SAT comparison, baseline protection fallback display), Independent Validation Inspector (constraint breakdown, Factual Mode capacity data gap notice), and Disruption Sandbox (EVT-DEMO-001 through 005 + synthetic closure, M601 saturation infeasibility diagnosis, atomic state rollback). Expose complete state matrix: loading skeletons during solver runs, error banners, non-color-only accessible badges, empty states. Strict preservation of source CSVs, 86 physical vs 70 confirmed active rooms, and P4–P6 core algorithms.</w:t>
             </w:r>
           </w:p>
         </w:tc>
@@ -5322,18 +5302,8 @@
             <w:shd w:fill="F2F6F9"/>
           </w:tcPr>
           <w:p>
-            <w:pPr>
-              <w:pStyle w:val="TableText"/>
-            </w:pPr>
-            <w:r/>
-            <w:r>
-              <w:rPr>
-                <w:rFonts w:ascii="Aptos" w:hAnsi="Aptos"/>
-                <w:b w:val="0"/>
-                <w:color w:val="17242E"/>
-                <w:sz w:val="13"/>
-              </w:rPr>
-              <w:t>End-to-end evidence for real supported controls and accessible status.</w:t>
+            <w:r>
+              <w:t>End-to-end evidence for all 5 functional views wired to real backend models; FastAPI REST endpoints passing automated integration tests; odd-cycle baseline fallback truthfully explained; M601 saturation infeasibility truthfully diagnosed; atomic rollback verified; visual alignment with approved ClassroomIQ UI benchmark; 0 new npm packages; all backend unit and API integration tests passing.</w:t>
             </w:r>
           </w:p>
         </w:tc>
@@ -5350,18 +5320,8 @@
             <w:shd w:fill="F2F6F9"/>
           </w:tcPr>
           <w:p>
-            <w:pPr>
-              <w:pStyle w:val="TableText"/>
-            </w:pPr>
-            <w:r/>
-            <w:r>
-              <w:rPr>
-                <w:rFonts w:ascii="Aptos" w:hAnsi="Aptos"/>
-                <w:b w:val="0"/>
-                <w:color w:val="17242E"/>
-                <w:sz w:val="13"/>
-              </w:rPr>
-              <w:t>API/UI contracts + P7 order</w:t>
+            <w:r>
+              <w:t>API/UI contracts + PAR-CIQ-P7-20261010-01</w:t>
             </w:r>
           </w:p>
         </w:tc>
@@ -9747,18 +9707,8 @@
             </w:tcMar>
           </w:tcPr>
           <w:p>
-            <w:pPr>
-              <w:pStyle w:val="TableText"/>
-            </w:pPr>
-            <w:r/>
-            <w:r>
-              <w:rPr>
-                <w:rFonts w:ascii="Aptos" w:hAnsi="Aptos"/>
-                <w:b w:val="0"/>
-                <w:color w:val="17242E"/>
-                <w:sz w:val="14"/>
-              </w:rPr>
-              <w:t>P5/P6 contracts implemented as applicable; approved screen scope and user/permission model; P7 order lists exact workflows.</w:t>
+            <w:r>
+              <w:t>P5/P6 contracts implemented and accepted (commit 9f6fea2); all 45 automated backend tests passing; approved ClassroomIQ UI benchmark visual design reference; P7 Phase Authorization Record PAR-CIQ-P7-20261010-01 prepared.</w:t>
             </w:r>
           </w:p>
         </w:tc>
@@ -9808,18 +9758,8 @@
             <w:shd w:fill="F2F6F9"/>
           </w:tcPr>
           <w:p>
-            <w:pPr>
-              <w:pStyle w:val="TableText"/>
-            </w:pPr>
-            <w:r/>
-            <w:r>
-              <w:rPr>
-                <w:rFonts w:ascii="Aptos" w:hAnsi="Aptos"/>
-                <w:b w:val="0"/>
-                <w:color w:val="17242E"/>
-                <w:sz w:val="14"/>
-              </w:rPr>
-              <w:t>Connect actual APIs; implement loading/empty/error/partial/unknown/stale states; show validator results/reasons; distinguish current simulation from published version; implement only approved dashboards, filters, reports and exports.</w:t>
+            <w:r>
+              <w:t>Connect real backend modules via FastAPI REST endpoints (backend/app/main.py, backend/app/api/); implement zero-build Vanilla SPA (frontend/index.html, frontend/css/styles.css, frontend/js/api.js, frontend/js/components/); serve static frontend directly from FastAPI; implement Operations Dashboard, Timetable Grid, Allocation Studio with baseline fallback display, Validation Inspector with Factual Mode data gap labeling, Disruption Sandbox with M601 saturation diagnosis and atomic rollback; loading skeletons, error states, non-color badges, empty states.</w:t>
             </w:r>
           </w:p>
         </w:tc>
@@ -9867,18 +9807,8 @@
             </w:tcMar>
           </w:tcPr>
           <w:p>
-            <w:pPr>
-              <w:pStyle w:val="TableText"/>
-            </w:pPr>
-            <w:r/>
-            <w:r>
-              <w:rPr>
-                <w:rFonts w:ascii="Aptos" w:hAnsi="Aptos"/>
-                <w:b w:val="0"/>
-                <w:color w:val="17242E"/>
-                <w:sz w:val="14"/>
-              </w:rPr>
-              <w:t>No inert controls presented as functional; no mock-only values presented as live; no unsupported roles, publication actions or export formats; no color-only status.</w:t>
+            <w:r>
+              <w:t>Strictly forbidden: modifying original CSVs in data/; treating benchmark as a data source; inventing room allocations, enrollments, capacities, or facilities; blurring 86 physical rooms vs 70 confirmed active rooms; representing unknown/synthetic data as verified facts; omitting baseline fallback when candidate does not beat baseline; describing synthetic travel proxies as measured walking times; rewriting P4–P6 algorithms to simplify UI integration; color-only status badges; inert clickable controls without working handlers or disabled states.</w:t>
             </w:r>
           </w:p>
         </w:tc>
@@ -9928,18 +9858,8 @@
             <w:shd w:fill="F2F6F9"/>
           </w:tcPr>
           <w:p>
-            <w:pPr>
-              <w:pStyle w:val="TableText"/>
-            </w:pPr>
-            <w:r/>
-            <w:r>
-              <w:rPr>
-                <w:rFonts w:ascii="Aptos" w:hAnsi="Aptos"/>
-                <w:b w:val="0"/>
-                <w:color w:val="17242E"/>
-                <w:sz w:val="14"/>
-              </w:rPr>
-              <w:t>Screen-to-API map; interaction tests; screenshot/test artifact set; status-state matrix; keyboard/accessibility checks; export validity tests where in scope.</w:t>
+            <w:r>
+              <w:t>Screen-to-API contract map; API integration tests (backend/tests/test_api.py); responsive layout verification (desktop 1280px, tablet 768px, mobile 375px); state matrix (loading/error/empty/retained); data-integrity checksum audit.</w:t>
             </w:r>
           </w:p>
         </w:tc>
@@ -9987,18 +9907,8 @@
             </w:tcMar>
           </w:tcPr>
           <w:p>
-            <w:pPr>
-              <w:pStyle w:val="TableText"/>
-            </w:pPr>
-            <w:r/>
-            <w:r>
-              <w:rPr>
-                <w:rFonts w:ascii="Aptos" w:hAnsi="Aptos"/>
-                <w:b w:val="0"/>
-                <w:color w:val="17242E"/>
-                <w:sz w:val="14"/>
-              </w:rPr>
-              <w:t>API/UI integration, empty/error/partial/unknown states, authorization checks, keyboard/focus and non-color status tests, SC-related flows.</w:t>
+            <w:r>
+              <w:t>FastAPI TestClient integration tests; end-to-end browser walkthrough; non-color-only accessibility verification; independent validator verification on displayed candidate allocations.</w:t>
             </w:r>
           </w:p>
         </w:tc>
@@ -10048,18 +9958,8 @@
             <w:shd w:fill="F2F6F9"/>
           </w:tcPr>
           <w:p>
-            <w:pPr>
-              <w:pStyle w:val="TableText"/>
-            </w:pPr>
-            <w:r/>
-            <w:r>
-              <w:rPr>
-                <w:rFonts w:ascii="Aptos" w:hAnsi="Aptos"/>
-                <w:b w:val="0"/>
-                <w:color w:val="17242E"/>
-                <w:sz w:val="14"/>
-              </w:rPr>
-              <w:t>Every visible action has implemented behavior or is clearly disabled/explained; all system result states are represented truthfully; end-to-end tests pass.</w:t>
+            <w:r>
+              <w:t>Every UI view functional and truthfully wired to backend models; odd-cycle baseline fallback explicitly explained in UI; M601 saturation infeasibility diagnosed; atomic rollback verified; 0 new npm packages; 100% test pass rate across backend and API tests.</w:t>
             </w:r>
           </w:p>
         </w:tc>
@@ -10107,18 +10007,8 @@
             </w:tcMar>
           </w:tcPr>
           <w:p>
-            <w:pPr>
-              <w:pStyle w:val="TableText"/>
-            </w:pPr>
-            <w:r/>
-            <w:r>
-              <w:rPr>
-                <w:rFonts w:ascii="Aptos" w:hAnsi="Aptos"/>
-                <w:b w:val="0"/>
-                <w:color w:val="17242E"/>
-                <w:sz w:val="14"/>
-              </w:rPr>
-              <w:t>Specific P7 authorization; P7 acceptance before benchmark/demo finalization.</w:t>
+            <w:r>
+              <w:t>Specific P7 owner authorization; P7 acceptance before Phase P8 (Packaging / Release Evaluation).</w:t>
             </w:r>
           </w:p>
         </w:tc>
@@ -22505,6 +22395,653 @@
       </w:r>
     </w:p>
     <w:p>
+      <w:r>
+        <w:t>18.2 Phase Authorization Record — Phase P7 Frontend Integration (PAR-CIQ-P7-20261010-01)</w:t>
+      </w:r>
+    </w:p>
+    <w:p>
+      <w:r>
+        <w:t>The following formal Phase Authorization Record governs Phase P7 (Frontend Integration, REST API Bridge &amp; UI Benchmark Realization). This record establishes technical architecture, API contracts, component scope, acceptance criteria, and strict data integrity boundaries. Implementation remains prohibited until explicitly approved.</w:t>
+      </w:r>
+    </w:p>
+    <w:tbl>
+      <w:tblPr>
+        <w:tblW w:type="auto" w:w="0"/>
+        <w:tblLook w:firstColumn="1" w:firstRow="1" w:lastColumn="0" w:lastRow="0" w:noHBand="0" w:noVBand="1" w:val="04A0"/>
+      </w:tblPr>
+      <w:tblGrid>
+        <w:gridCol w:w="4917"/>
+        <w:gridCol w:w="4917"/>
+      </w:tblGrid>
+      <w:tr>
+        <w:tc>
+          <w:tcPr>
+            <w:tcW w:type="dxa" w:w="4917"/>
+          </w:tcPr>
+          <w:p>
+            <w:r>
+              <w:t>Field</w:t>
+            </w:r>
+          </w:p>
+        </w:tc>
+        <w:tc>
+          <w:tcPr>
+            <w:tcW w:type="dxa" w:w="4917"/>
+          </w:tcPr>
+          <w:p>
+            <w:r>
+              <w:t>Entry</w:t>
+            </w:r>
+          </w:p>
+        </w:tc>
+      </w:tr>
+      <w:tr>
+        <w:tc>
+          <w:tcPr>
+            <w:tcW w:type="dxa" w:w="4917"/>
+          </w:tcPr>
+          <w:p>
+            <w:r>
+              <w:t>Authorization record ID</w:t>
+            </w:r>
+          </w:p>
+        </w:tc>
+        <w:tc>
+          <w:tcPr>
+            <w:tcW w:type="dxa" w:w="4917"/>
+          </w:tcPr>
+          <w:p>
+            <w:r>
+              <w:t>PAR-CIQ-P7-20261010-01</w:t>
+            </w:r>
+          </w:p>
+        </w:tc>
+      </w:tr>
+      <w:tr>
+        <w:tc>
+          <w:tcPr>
+            <w:tcW w:type="dxa" w:w="4917"/>
+          </w:tcPr>
+          <w:p>
+            <w:r>
+              <w:t>Phase ID and name</w:t>
+            </w:r>
+          </w:p>
+        </w:tc>
+        <w:tc>
+          <w:tcPr>
+            <w:tcW w:type="dxa" w:w="4917"/>
+          </w:tcPr>
+          <w:p>
+            <w:r>
+              <w:t>Phase P7 — Frontend Integration, REST API Bridge &amp; UI Benchmark Realization</w:t>
+            </w:r>
+          </w:p>
+        </w:tc>
+      </w:tr>
+      <w:tr>
+        <w:tc>
+          <w:tcPr>
+            <w:tcW w:type="dxa" w:w="4917"/>
+          </w:tcPr>
+          <w:p>
+            <w:r>
+              <w:t>Plan version / relevant ADRs</w:t>
+            </w:r>
+          </w:p>
+        </w:tc>
+        <w:tc>
+          <w:tcPr>
+            <w:tcW w:type="dxa" w:w="4917"/>
+          </w:tcPr>
+          <w:p>
+            <w:r>
+              <w:t>CIQ-PLAN-005 v0.2.4; ADR-001 (FastAPI Backend Architecture); ADR-002 (Modern Zero-Build Vanilla SPA Architecture aligned with approved ClassroomIQ UI benchmark); ADR-003 (Truthful Reporting &amp; Baseline Protection Fallback)</w:t>
+            </w:r>
+          </w:p>
+        </w:tc>
+      </w:tr>
+      <w:tr>
+        <w:tc>
+          <w:tcPr>
+            <w:tcW w:type="dxa" w:w="4917"/>
+          </w:tcPr>
+          <w:p>
+            <w:r>
+              <w:t>Approver(s) and date/time</w:t>
+            </w:r>
+          </w:p>
+        </w:tc>
+        <w:tc>
+          <w:tcPr>
+            <w:tcW w:type="dxa" w:w="4917"/>
+          </w:tcPr>
+          <w:p>
+            <w:r>
+              <w:t>ClassroomIQ Project Owner / Governance Authority (Pending Review &amp; Signature, 2026-10-10)</w:t>
+            </w:r>
+          </w:p>
+        </w:tc>
+      </w:tr>
+      <w:tr>
+        <w:tc>
+          <w:tcPr>
+            <w:tcW w:type="dxa" w:w="4917"/>
+          </w:tcPr>
+          <w:p>
+            <w:r>
+              <w:t>Authorization state</w:t>
+            </w:r>
+          </w:p>
+        </w:tc>
+        <w:tc>
+          <w:tcPr>
+            <w:tcW w:type="dxa" w:w="4917"/>
+          </w:tcPr>
+          <w:p>
+            <w:r>
+              <w:t>PREPARED — PENDING EXPLICIT OWNER APPROVAL (STOP GATE ACTIVE: NO IMPLEMENTATION AUTHORIZED)</w:t>
+            </w:r>
+          </w:p>
+        </w:tc>
+      </w:tr>
+      <w:tr>
+        <w:tc>
+          <w:tcPr>
+            <w:tcW w:type="dxa" w:w="4917"/>
+          </w:tcPr>
+          <w:p>
+            <w:r>
+              <w:t>Repository / workspace</w:t>
+            </w:r>
+          </w:p>
+        </w:tc>
+        <w:tc>
+          <w:tcPr>
+            <w:tcW w:type="dxa" w:w="4917"/>
+          </w:tcPr>
+          <w:p>
+            <w:r>
+              <w:t>D:\Projects\CommitCon</w:t>
+            </w:r>
+          </w:p>
+        </w:tc>
+      </w:tr>
+      <w:tr>
+        <w:tc>
+          <w:tcPr>
+            <w:tcW w:type="dxa" w:w="4917"/>
+          </w:tcPr>
+          <w:p>
+            <w:r>
+              <w:t>Branch and baseline commit/hash</w:t>
+            </w:r>
+          </w:p>
+        </w:tc>
+        <w:tc>
+          <w:tcPr>
+            <w:tcW w:type="dxa" w:w="4917"/>
+          </w:tcPr>
+          <w:p>
+            <w:r>
+              <w:t>Branch: feature/phase-p6-optimization-and-simulation; P6 Baseline Commit: 9f6fea2e89f4ce28d7bc9486afefca1252a0760b</w:t>
+            </w:r>
+          </w:p>
+        </w:tc>
+      </w:tr>
+      <w:tr>
+        <w:tc>
+          <w:tcPr>
+            <w:tcW w:type="dxa" w:w="4917"/>
+          </w:tcPr>
+          <w:p>
+            <w:r>
+              <w:t>Working-tree state verified by</w:t>
+            </w:r>
+          </w:p>
+        </w:tc>
+        <w:tc>
+          <w:tcPr>
+            <w:tcW w:type="dxa" w:w="4917"/>
+          </w:tcPr>
+          <w:p>
+            <w:r>
+              <w:t>Git working tree clean; 45 automated backend tests passing (pytest backend/tests/ -v); all 7 source CSV SHA256 checksums verified bit-for-bit against baseline.</w:t>
+            </w:r>
+          </w:p>
+        </w:tc>
+      </w:tr>
+      <w:tr>
+        <w:tc>
+          <w:tcPr>
+            <w:tcW w:type="dxa" w:w="4917"/>
+          </w:tcPr>
+          <w:p>
+            <w:r>
+              <w:t>Applicable gate evidence</w:t>
+            </w:r>
+          </w:p>
+        </w:tc>
+        <w:tc>
+          <w:tcPr>
+            <w:tcW w:type="dxa" w:w="4917"/>
+          </w:tcPr>
+          <w:p>
+            <w:r>
+              <w:t>Gate G6+ formally accepted for Phase P6 under Document 05 v0.2.3; Gate G7 (P7 Frontend Integration) authorization prepared.</w:t>
+            </w:r>
+          </w:p>
+        </w:tc>
+      </w:tr>
+      <w:tr>
+        <w:tc>
+          <w:tcPr>
+            <w:tcW w:type="dxa" w:w="4917"/>
+          </w:tcPr>
+          <w:p>
+            <w:r>
+              <w:t>Approved requirement/decision IDs</w:t>
+            </w:r>
+          </w:p>
+        </w:tc>
+        <w:tc>
+          <w:tcPr>
+            <w:tcW w:type="dxa" w:w="4917"/>
+          </w:tcPr>
+          <w:p>
+            <w:r>
+              <w:t>REQ-DASHBOARD (Operations dashboard &amp; provenance); REQ-SPATIAL (Timetable grid, room 86/70, cohort, program views); REQ-ALLOC-STUDIO (Optimization execution &amp; baseline comparison); REQ-VALID-INSPECT (Independent validation audit inspector); REQ-DISRUPT-SANDBOX (Disruption simulation: M601 saturation diagnosis, classroom recovery, atomic rollback); REQ-API-BRIDGE (FastAPI REST endpoints with loading, error, empty states); REQ-UI-ALIGN (Responsive design system aligned with approved benchmark).</w:t>
+            </w:r>
+          </w:p>
+        </w:tc>
+      </w:tr>
+      <w:tr>
+        <w:tc>
+          <w:tcPr>
+            <w:tcW w:type="dxa" w:w="4917"/>
+          </w:tcPr>
+          <w:p>
+            <w:r>
+              <w:t>Allowed files/modules/mutations</w:t>
+            </w:r>
+          </w:p>
+        </w:tc>
+        <w:tc>
+          <w:tcPr>
+            <w:tcW w:type="dxa" w:w="4917"/>
+          </w:tcPr>
+          <w:p>
+            <w:r>
+              <w:t>Backend API Layer: backend/app/main.py, backend/app/api/__init__.py, backend/app/api/status.py, backend/app/api/inventory.py, backend/app/api/allocation.py, backend/app/api/validation.py, backend/app/api/simulation.py. Backend Tests: backend/tests/test_api.py. Frontend Static Files: frontend/index.html, frontend/css/styles.css, frontend/js/api.js, frontend/js/components/*.js, frontend/assets/*. Documentation: docs/ClassroomIQ_Document_05_Implementation_Roadmap_and_Build_Authorization_v0.2.0.docx. STRICT PROHIBITION: No edits to data/*.csv; no rewriting P4–P6 core algorithms.</w:t>
+            </w:r>
+          </w:p>
+        </w:tc>
+      </w:tr>
+      <w:tr>
+        <w:tc>
+          <w:tcPr>
+            <w:tcW w:type="dxa" w:w="4917"/>
+          </w:tcPr>
+          <w:p>
+            <w:r>
+              <w:t>Explicit exclusions</w:t>
+            </w:r>
+          </w:p>
+        </w:tc>
+        <w:tc>
+          <w:tcPr>
+            <w:tcW w:type="dxa" w:w="4917"/>
+          </w:tcPr>
+          <w:p>
+            <w:r>
+              <w:t>Strictly forbidden: modifying original CSVs in data/; treating benchmark as a data source; inventing room allocations, enrollments, capacities, or facilities; blurring 86 physical rooms vs 70 confirmed active rooms; representing unknown/synthetic data as verified facts; omitting baseline fallback when candidate does not beat baseline; describing synthetic travel proxies as measured walking times; rewriting P4–P6 algorithms to simplify UI integration; color-only status badges; inert clickable controls without working handlers or disabled states.</w:t>
+            </w:r>
+          </w:p>
+        </w:tc>
+      </w:tr>
+      <w:tr>
+        <w:tc>
+          <w:tcPr>
+            <w:tcW w:type="dxa" w:w="4917"/>
+          </w:tcPr>
+          <w:p>
+            <w:r>
+              <w:t>Permitted dependencies / installation</w:t>
+            </w:r>
+          </w:p>
+        </w:tc>
+        <w:tc>
+          <w:tcPr>
+            <w:tcW w:type="dxa" w:w="4917"/>
+          </w:tcPr>
+          <w:p>
+            <w:r>
+              <w:t>NONE (0 new dependencies). Reuse installed packages: fastapi (0.141.1), uvicorn (0.53.0), starlette (1.7.0), pydantic (2.13.4), ortools (9.15.6755), pytest (9.1.1). Frontend built with zero npm dependencies (Vanilla HTML5/CSS3/ES6+).</w:t>
+            </w:r>
+          </w:p>
+        </w:tc>
+      </w:tr>
+      <w:tr>
+        <w:tc>
+          <w:tcPr>
+            <w:tcW w:type="dxa" w:w="4917"/>
+          </w:tcPr>
+          <w:p>
+            <w:r>
+              <w:t>Data profile / schema contract</w:t>
+            </w:r>
+          </w:p>
+        </w:tc>
+        <w:tc>
+          <w:tcPr>
+            <w:tcW w:type="dxa" w:w="4917"/>
+          </w:tcPr>
+          <w:p>
+            <w:r>
+              <w:t>Factual Mode: Read directly from validated CSV models; capacity status explicitly exposed as INSUFFICIENT_EVIDENCE (Data Gap). Synthetic Evaluation Profile: Explicitly labeled toggle in UI providing scenario demonstrations with clear synthetic assumptions banner. 7 source CSVs: Immutable seed datasets.</w:t>
+            </w:r>
+          </w:p>
+        </w:tc>
+      </w:tr>
+      <w:tr>
+        <w:tc>
+          <w:tcPr>
+            <w:tcW w:type="dxa" w:w="4917"/>
+          </w:tcPr>
+          <w:p>
+            <w:r>
+              <w:t>Commands and tests required</w:t>
+            </w:r>
+          </w:p>
+        </w:tc>
+        <w:tc>
+          <w:tcPr>
+            <w:tcW w:type="dxa" w:w="4917"/>
+          </w:tcPr>
+          <w:p>
+            <w:r>
+              <w:t>Backend Unit &amp; Integration Tests: python -m pytest backend/tests/ -v (all 45 existing tests + new API router tests must pass 100%). FastAPI Local Server Launch: python -m uvicorn backend.app.main:app --host 127.0.0.1 --port 8000. Data Integrity Verification: SHA256 checksum verification script for all 7 CSV files. Frontend Verification: Visual alignment audit, responsive layout checks across breakpoints (desktop 1280px, tablet 768px, mobile 375px), API error/loading state checks.</w:t>
+            </w:r>
+          </w:p>
+        </w:tc>
+      </w:tr>
+      <w:tr>
+        <w:tc>
+          <w:tcPr>
+            <w:tcW w:type="dxa" w:w="4917"/>
+          </w:tcPr>
+          <w:p>
+            <w:r>
+              <w:t>Acceptance thresholds</w:t>
+            </w:r>
+          </w:p>
+        </w:tc>
+        <w:tc>
+          <w:tcPr>
+            <w:tcW w:type="dxa" w:w="4917"/>
+          </w:tcPr>
+          <w:p>
+            <w:r>
+              <w:t>All 45 existing core tests + all new API integration tests pass; API responds with HTTP 200 and schema-conforming payloads across all defined endpoints; Dashboard displays verified source provenance and row counts; Timetable grid renders sessions for Odd (593) and Even (570) cycles without crashing; Room catalog displays 86 physical rooms and flags the 16 rooms lacking confirmed availability; Allocation comparison displays genuine 60.52% walking-time reduction on Even cycle, and truthfully displays retained baseline with 0.0 min reduction and time-limited status on Odd cycle; Validation inspector displays zero double-bookings, zero cohort clashes, flags 10 computing lab sessions, and identifies missing capacity data in Factual Mode; Disruption simulation truthfully displays infeasible_repair with campus-wide lab saturation for M601, successful repair for classroom events and synthetic closure, and 100% atomic state restoration upon rollback; Complete state handling: skeleton loaders during solver runs, error banners, accessible non-color-only badges.</w:t>
+            </w:r>
+          </w:p>
+        </w:tc>
+      </w:tr>
+      <w:tr>
+        <w:tc>
+          <w:tcPr>
+            <w:tcW w:type="dxa" w:w="4917"/>
+          </w:tcPr>
+          <w:p>
+            <w:r>
+              <w:t>Rollback/recovery procedure</w:t>
+            </w:r>
+          </w:p>
+        </w:tc>
+        <w:tc>
+          <w:tcPr>
+            <w:tcW w:type="dxa" w:w="4917"/>
+          </w:tcPr>
+          <w:p>
+            <w:r>
+              <w:t>Git atomic revert to baseline commit 9f6fea2. No database migrations or persistent state mutations exist.</w:t>
+            </w:r>
+          </w:p>
+        </w:tc>
+      </w:tr>
+      <w:tr>
+        <w:tc>
+          <w:tcPr>
+            <w:tcW w:type="dxa" w:w="4917"/>
+          </w:tcPr>
+          <w:p>
+            <w:r>
+              <w:t>Stop conditions / expiry</w:t>
+            </w:r>
+          </w:p>
+        </w:tc>
+        <w:tc>
+          <w:tcPr>
+            <w:tcW w:type="dxa" w:w="4917"/>
+          </w:tcPr>
+          <w:p>
+            <w:r>
+              <w:t>Stop and ask immediately if: any source CSV is modified; core algorithm rewrite is requested; unapproved third-party dependencies are required; solver exceeds 10.0s search limit; candidate allocation fails independent validation. Order expires: 2026-10-17 or upon formal completion of Phase P7 Acceptance Review.</w:t>
+            </w:r>
+          </w:p>
+        </w:tc>
+      </w:tr>
+      <w:tr>
+        <w:tc>
+          <w:tcPr>
+            <w:tcW w:type="dxa" w:w="4917"/>
+          </w:tcPr>
+          <w:p>
+            <w:r>
+              <w:t>Implementer</w:t>
+            </w:r>
+          </w:p>
+        </w:tc>
+        <w:tc>
+          <w:tcPr>
+            <w:tcW w:type="dxa" w:w="4917"/>
+          </w:tcPr>
+          <w:p>
+            <w:r>
+              <w:t>Antigravity Coding Assistant</w:t>
+            </w:r>
+          </w:p>
+        </w:tc>
+      </w:tr>
+      <w:tr>
+        <w:tc>
+          <w:tcPr>
+            <w:tcW w:type="dxa" w:w="4917"/>
+          </w:tcPr>
+          <w:p>
+            <w:r>
+              <w:t>Reviewer / acceptance owner</w:t>
+            </w:r>
+          </w:p>
+        </w:tc>
+        <w:tc>
+          <w:tcPr>
+            <w:tcW w:type="dxa" w:w="4917"/>
+          </w:tcPr>
+          <w:p>
+            <w:r>
+              <w:t>ClassroomIQ Project Owner / Governance Authority</w:t>
+            </w:r>
+          </w:p>
+        </w:tc>
+      </w:tr>
+      <w:tr>
+        <w:tc>
+          <w:tcPr>
+            <w:tcW w:type="dxa" w:w="4917"/>
+          </w:tcPr>
+          <w:p>
+            <w:r>
+              <w:t>Evidence location / naming</w:t>
+            </w:r>
+          </w:p>
+        </w:tc>
+        <w:tc>
+          <w:tcPr>
+            <w:tcW w:type="dxa" w:w="4917"/>
+          </w:tcPr>
+          <w:p>
+            <w:r>
+              <w:t>Artifacts and test logs in &lt;appDataDir&gt;\brain\&lt;conversation-id&gt;\; docs/ClassroomIQ_Document_05_Implementation_Roadmap_and_Build_Authorization_v0.2.0.docx; backend/tests/test_api.py test logs.</w:t>
+            </w:r>
+          </w:p>
+        </w:tc>
+      </w:tr>
+    </w:tbl>
+    <w:p>
+      <w:r>
+        <w:t>18.3 Phase P7 Authorization Decision</w:t>
+      </w:r>
+    </w:p>
+    <w:tbl>
+      <w:tblPr>
+        <w:tblW w:type="auto" w:w="0"/>
+        <w:tblLook w:firstColumn="1" w:firstRow="1" w:lastColumn="0" w:lastRow="0" w:noHBand="0" w:noVBand="1" w:val="04A0"/>
+      </w:tblPr>
+      <w:tblGrid>
+        <w:gridCol w:w="2459"/>
+        <w:gridCol w:w="2459"/>
+        <w:gridCol w:w="2459"/>
+        <w:gridCol w:w="2459"/>
+      </w:tblGrid>
+      <w:tr>
+        <w:tc>
+          <w:tcPr>
+            <w:tcW w:type="dxa" w:w="2459"/>
+          </w:tcPr>
+          <w:p>
+            <w:r>
+              <w:t>Decision</w:t>
+            </w:r>
+          </w:p>
+        </w:tc>
+        <w:tc>
+          <w:tcPr>
+            <w:tcW w:type="dxa" w:w="2459"/>
+          </w:tcPr>
+          <w:p>
+            <w:r>
+              <w:t>Name / Team</w:t>
+            </w:r>
+          </w:p>
+        </w:tc>
+        <w:tc>
+          <w:tcPr>
+            <w:tcW w:type="dxa" w:w="2459"/>
+          </w:tcPr>
+          <w:p>
+            <w:r>
+              <w:t>Signature or Recorded Confirmation</w:t>
+            </w:r>
+          </w:p>
+        </w:tc>
+        <w:tc>
+          <w:tcPr>
+            <w:tcW w:type="dxa" w:w="2459"/>
+          </w:tcPr>
+          <w:p>
+            <w:r>
+              <w:t>Date / Time</w:t>
+            </w:r>
+          </w:p>
+        </w:tc>
+      </w:tr>
+      <w:tr>
+        <w:tc>
+          <w:tcPr>
+            <w:tcW w:type="dxa" w:w="2459"/>
+          </w:tcPr>
+          <w:p>
+            <w:r>
+              <w:t>PHASE AUTHORIZATION: PENDING REVIEW</w:t>
+            </w:r>
+          </w:p>
+        </w:tc>
+        <w:tc>
+          <w:tcPr>
+            <w:tcW w:type="dxa" w:w="2459"/>
+          </w:tcPr>
+          <w:p>
+            <w:r>
+              <w:t>ClassroomIQ Project Owner</w:t>
+            </w:r>
+          </w:p>
+        </w:tc>
+        <w:tc>
+          <w:tcPr>
+            <w:tcW w:type="dxa" w:w="2459"/>
+          </w:tcPr>
+          <w:p>
+            <w:r>
+              <w:t>PENDING EXPLICIT APPROVAL</w:t>
+            </w:r>
+          </w:p>
+        </w:tc>
+        <w:tc>
+          <w:tcPr>
+            <w:tcW w:type="dxa" w:w="2459"/>
+          </w:tcPr>
+          <w:p>
+            <w:r>
+              <w:t>2026-10-10</w:t>
+            </w:r>
+          </w:p>
+        </w:tc>
+      </w:tr>
+      <w:tr>
+        <w:tc>
+          <w:tcPr>
+            <w:tcW w:type="dxa" w:w="2459"/>
+          </w:tcPr>
+          <w:p>
+            <w:r>
+              <w:t>Scope Owner Approval</w:t>
+            </w:r>
+          </w:p>
+        </w:tc>
+        <w:tc>
+          <w:tcPr>
+            <w:tcW w:type="dxa" w:w="2459"/>
+          </w:tcPr>
+          <w:p>
+            <w:r>
+              <w:t>Governance Authority</w:t>
+            </w:r>
+          </w:p>
+        </w:tc>
+        <w:tc>
+          <w:tcPr>
+            <w:tcW w:type="dxa" w:w="2459"/>
+          </w:tcPr>
+          <w:p>
+            <w:r>
+              <w:t>PENDING EXPLICIT APPROVAL</w:t>
+            </w:r>
+          </w:p>
+        </w:tc>
+        <w:tc>
+          <w:tcPr>
+            <w:tcW w:type="dxa" w:w="2459"/>
+          </w:tcPr>
+          <w:p>
+            <w:r>
+              <w:t>2026-10-10</w:t>
+            </w:r>
+          </w:p>
+        </w:tc>
+      </w:tr>
+    </w:tbl>
+    <w:p>
       <w:pPr>
         <w:pStyle w:val="Heading1"/>
       </w:pPr>
@@ -25286,6 +25823,48 @@
           </w:p>
         </w:tc>
       </w:tr>
+      <w:tr>
+        <w:tc>
+          <w:tcPr>
+            <w:tcW w:type="dxa" w:w="2459"/>
+          </w:tcPr>
+          <w:p>
+            <w:r>
+              <w:t>0.2.4</w:t>
+            </w:r>
+          </w:p>
+        </w:tc>
+        <w:tc>
+          <w:tcPr>
+            <w:tcW w:type="dxa" w:w="2459"/>
+          </w:tcPr>
+          <w:p>
+            <w:r>
+              <w:t>2026-10-10</w:t>
+            </w:r>
+          </w:p>
+        </w:tc>
+        <w:tc>
+          <w:tcPr>
+            <w:tcW w:type="dxa" w:w="2459"/>
+          </w:tcPr>
+          <w:p>
+            <w:r>
+              <w:t>Phase P7 Frontend Integration Authorization Preparation: (1) Formulated formal Phase Authorization Record PAR-CIQ-P7-20261010-01 covering FastAPI REST bridge, Vanilla JS/CSS responsive SPA, Operations Dashboard, Timetable Grid, Allocation Studio with baseline fallback preservation, Validation Inspector with Factual Mode data gap labeling, and Disruption Sandbox with M601 saturation diagnosis and atomic rollback; (2) Reused existing environment dependencies (FastAPI, Uvicorn, Starlette, Pydantic, OR-Tools) with zero new packages; (3) Codified non-negotiable data integrity rules preserving source CSVs, 86 physical vs 70 confirmed active rooms, and P4–P6 core algorithms; (4) Set strict stop gate: authorization preparation only, no frontend coding or source mutation authorized until explicit owner approval.</w:t>
+            </w:r>
+          </w:p>
+        </w:tc>
+        <w:tc>
+          <w:tcPr>
+            <w:tcW w:type="dxa" w:w="2459"/>
+          </w:tcPr>
+          <w:p>
+            <w:r>
+              <w:t>CONTROLLED DRAFT — PHASE P7 FRONTEND INTEGRATION AUTHORIZATION PREPARATION (PAR-CIQ-P7-20261010-01)</w:t>
+            </w:r>
+          </w:p>
+        </w:tc>
+      </w:tr>
     </w:tbl>
     <w:p>
       <w:pPr>
@@ -26704,7 +27283,7 @@
     <w:p>
       <w:pPr/>
       <w:r>
-        <w:t>Phase P6 build authorization is granted under PAR-CIQ-P6-20261009-01 (CIQ-PLAN-005 v0.2.1) and formally accepted at v0.2.3 with documented odd-cycle optimization limitation.</w:t>
+        <w:t>Phase P6 build authorization is granted under PAR-CIQ-P6-20261009-01 (CIQ-PLAN-005 v0.2.1) and formally accepted at v0.2.3 with documented odd-cycle optimization limitation. Phase P7 build authorization is prepared under PAR-CIQ-P7-20261010-01 (CIQ-PLAN-005 v0.2.4) and pending project owner review and explicit authorization.</w:t>
       </w:r>
     </w:p>
     <w:sectPr>

</xml_diff>

<commit_message>
docs(governance): amend Document 05 to v0.2.5 registering approved UI benchmark (Image 2) and realigning P7 scope
</commit_message>
<xml_diff>
--- a/docs/ClassroomIQ_Document_05_Implementation_Roadmap_and_Build_Authorization_v0.2.0.docx
+++ b/docs/ClassroomIQ_Document_05_Implementation_Roadmap_and_Build_Authorization_v0.2.0.docx
@@ -287,7 +287,7 @@
           </w:tcPr>
           <w:p>
             <w:r>
-              <w:t>0.2.4</w:t>
+              <w:t>0.2.5</w:t>
             </w:r>
           </w:p>
         </w:tc>
@@ -387,7 +387,7 @@
           </w:tcPr>
           <w:p>
             <w:r>
-              <w:t>CONTROLLED DRAFT — PHASE P7 FRONTEND INTEGRATION AUTHORIZATION PREPARATION (PAR-CIQ-P7-20261010-01)</w:t>
+              <w:t>CONTROLLED DRAFT — PHASE P7 BENCHMARK REGISTRATION &amp; AUTHORIZATION READY (PAR-CIQ-P7-20261010-01)</w:t>
             </w:r>
           </w:p>
         </w:tc>
@@ -497,19 +497,8 @@
             <w:shd w:fill="F2F6F9"/>
           </w:tcPr>
           <w:p>
-            <w:pPr>
-              <w:pStyle w:val="TableText"/>
-            </w:pPr>
-            <w:r>
-              <w:t>CIQ-ANT-002 v1.0.0; CIQ-ARCH-003 v0.1.0; CIQ-DATA-004 v0.2.0</w:t>
-            </w:r>
-            <w:r>
-              <w:rPr>
-                <w:rFonts w:ascii="Aptos" w:hAnsi="Aptos"/>
-                <w:b w:val="0"/>
-                <w:color w:val="17242E"/>
-                <w:sz w:val="16"/>
-              </w:rPr>
+            <w:r>
+              <w:t>CIQ-ANT-002 v1.0.0; CIQ-ARCH-003 v0.1.0; CIQ-DATA-004 v0.2.0; UI Benchmark Reference: Image 2 (docs/ClassroomIQ_UI_Benchmark_Approved_Reference.jpg)</w:t>
             </w:r>
           </w:p>
         </w:tc>
@@ -668,7 +657,7 @@
           </w:tcPr>
           <w:p>
             <w:r>
-              <w:t>D:\Projects\CommitCon (branch: feature/phase-p6-optimization-and-simulation, baseline commit: 9f6fea2)</w:t>
+              <w:t>D:\Projects\CommitCon (branch: feature/phase-p6-optimization-and-simulation, baseline commit: 0750569)</w:t>
             </w:r>
           </w:p>
         </w:tc>
@@ -3126,7 +3115,7 @@
           </w:tcPr>
           <w:p>
             <w:r>
-              <w:t>PHASE P6 ACCEPTED (v0.2.3); G7 (Phase P7 Frontend Integration) Authorization Prepared under PAR-CIQ-P7-20261010-01 pending owner review and explicit approval.</w:t>
+              <w:t>PHASE P6 ACCEPTED (v0.2.3); G7 (Phase P7 Frontend Integration) Authorization Prepared &amp; Benchmark Registered under PAR-CIQ-P7-20261010-01 (v0.2.5) pending owner review and explicit approval.</w:t>
             </w:r>
           </w:p>
         </w:tc>
@@ -5285,7 +5274,7 @@
           </w:tcPr>
           <w:p>
             <w:r>
-              <w:t>Implement FastAPI REST integration layer and modern zero-build Vanilla SPA frontend (HTML5/CSS3/ES6+) providing 5 unified views: Operations Dashboard, Timetable Grid (Odd 593 / Even 570 sessions, Room 86/70 filter, Cohort filter), Allocation Studio (side-by-side Baseline vs CP-SAT comparison, baseline protection fallback display), Independent Validation Inspector (constraint breakdown, Factual Mode capacity data gap notice), and Disruption Sandbox (EVT-DEMO-001 through 005 + synthetic closure, M601 saturation infeasibility diagnosis, atomic state rollback). Expose complete state matrix: loading skeletons during solver runs, error banners, non-color-only accessible badges, empty states. Strict preservation of source CSVs, 86 physical vs 70 confirmed active rooms, and P4–P6 core algorithms.</w:t>
+              <w:t>Implement FastAPI REST integration layer and zero-build Vanilla SPA frontend (HTML5/CSS3/ES6+) adhering to the approved ClassroomIQ UI benchmark (Image 2: Academic Scheduling &amp; Optimization Dashboard). The frontend provides 5 core operational views: Operations Dashboard, Timetable Grid (Odd 680 / Even 570 sessions, Room inventory 86 filter, 45 Cohorts filter, 5 Programs filter; no unverified department filter), Allocation Studio (side-by-side Baseline vs CP-SAT comparison, baseline protection fallback display), Independent Validation Inspector (constraint breakdown, Factual Mode capacity data gap notice), and Disruption Sandbox (EVT-DEMO-001 through 005 + synthetic closure, M601 saturation infeasibility diagnosis, atomic state rollback). Expose complete state matrix: loading skeletons during solver runs, error banners, non-color-only accessible badges, empty states. Strict adherence to benchmark rules: benchmark layout and navigation followed faithfully; all displayed timetable cells treated as illustrative rather than factual allocations; operational values sourced exclusively from backend; source CSVs, 86-room physical inventory, and P4–P6 core algorithms strictly preserved.</w:t>
             </w:r>
           </w:p>
         </w:tc>
@@ -5303,7 +5292,7 @@
           </w:tcPr>
           <w:p>
             <w:r>
-              <w:t>End-to-end evidence for all 5 functional views wired to real backend models; FastAPI REST endpoints passing automated integration tests; odd-cycle baseline fallback truthfully explained; M601 saturation infeasibility truthfully diagnosed; atomic rollback verified; visual alignment with approved ClassroomIQ UI benchmark; 0 new npm packages; all backend unit and API integration tests passing.</w:t>
+              <w:t>End-to-end evidence for all 5 functional views wired to real backend models; FastAPI REST endpoints passing automated integration tests; odd-cycle baseline fallback truthfully explained; M601 saturation infeasibility truthfully diagnosed; atomic rollback verified; visual alignment with approved ClassroomIQ UI benchmark (Image 2); 0 new npm packages; all backend unit and API integration tests passing.</w:t>
             </w:r>
           </w:p>
         </w:tc>
@@ -5321,7 +5310,7 @@
           </w:tcPr>
           <w:p>
             <w:r>
-              <w:t>API/UI contracts + PAR-CIQ-P7-20261010-01</w:t>
+              <w:t>API/UI contracts + PAR-CIQ-P7-20261010-01 + UI Benchmark (Image 2)</w:t>
             </w:r>
           </w:p>
         </w:tc>
@@ -9708,7 +9697,7 @@
           </w:tcPr>
           <w:p>
             <w:r>
-              <w:t>P5/P6 contracts implemented and accepted (commit 9f6fea2); all 45 automated backend tests passing; approved ClassroomIQ UI benchmark visual design reference; P7 Phase Authorization Record PAR-CIQ-P7-20261010-01 prepared.</w:t>
+              <w:t>P5/P6 contracts implemented and accepted (commit 9f6fea2); all 45 automated backend tests passing; approved ClassroomIQ UI benchmark visual design reference (Image 2: docs/ClassroomIQ_UI_Benchmark_Approved_Reference.jpg); P7 Phase Authorization Record PAR-CIQ-P7-20261010-01 prepared and benchmark registered (v0.2.5).</w:t>
             </w:r>
           </w:p>
         </w:tc>
@@ -9759,7 +9748,7 @@
           </w:tcPr>
           <w:p>
             <w:r>
-              <w:t>Connect real backend modules via FastAPI REST endpoints (backend/app/main.py, backend/app/api/); implement zero-build Vanilla SPA (frontend/index.html, frontend/css/styles.css, frontend/js/api.js, frontend/js/components/); serve static frontend directly from FastAPI; implement Operations Dashboard, Timetable Grid, Allocation Studio with baseline fallback display, Validation Inspector with Factual Mode data gap labeling, Disruption Sandbox with M601 saturation diagnosis and atomic rollback; loading skeletons, error states, non-color badges, empty states.</w:t>
+              <w:t>Connect real backend modules via FastAPI REST endpoints (backend/app/main.py, backend/app/api/); implement zero-build Vanilla SPA (frontend/index.html, frontend/css/styles.css, frontend/js/api.js, frontend/js/components/); serve static frontend directly from FastAPI; implement Operations Dashboard, Timetable Grid (Odd 680 / Even 570 sessions, 5 programs, 45 cohorts, 86 rooms inventory), Allocation Studio with baseline fallback display, Validation Inspector with Factual Mode data gap labeling, Disruption Sandbox with M601 saturation diagnosis and atomic rollback; loading skeletons, error states, non-color badges, empty states. Follow layout, visual hierarchy, and navigation of Image 2.</w:t>
             </w:r>
           </w:p>
         </w:tc>
@@ -9808,7 +9797,7 @@
           </w:tcPr>
           <w:p>
             <w:r>
-              <w:t>Strictly forbidden: modifying original CSVs in data/; treating benchmark as a data source; inventing room allocations, enrollments, capacities, or facilities; blurring 86 physical rooms vs 70 confirmed active rooms; representing unknown/synthetic data as verified facts; omitting baseline fallback when candidate does not beat baseline; describing synthetic travel proxies as measured walking times; rewriting P4–P6 algorithms to simplify UI integration; color-only status badges; inert clickable controls without working handlers or disabled states.</w:t>
+              <w:t>Strictly forbidden: modifying original CSVs in data/; treating benchmark cells as a data source (all mock cells like CS101, EE101 are illustrative); inventing room allocations, enrollments, capacities, departments, or facilities; claiming 70 rooms active without evidence (inventory is 86 rooms); presenting department filtering as factual without a documented mapping; representing unknown/synthetic data as verified facts; omitting baseline fallback when candidate does not beat baseline; describing synthetic travel proxies as measured walking times; rewriting P4–P6 algorithms to simplify UI integration; color-only status badges; inert clickable controls without working handlers or disabled states.</w:t>
             </w:r>
           </w:p>
         </w:tc>
@@ -9859,7 +9848,7 @@
           </w:tcPr>
           <w:p>
             <w:r>
-              <w:t>Screen-to-API contract map; API integration tests (backend/tests/test_api.py); responsive layout verification (desktop 1280px, tablet 768px, mobile 375px); state matrix (loading/error/empty/retained); data-integrity checksum audit.</w:t>
+              <w:t>Screen-to-API contract map; API integration tests (backend/tests/test_api.py); visual alignment check against Image 2; responsive layout verification (desktop 1280px, tablet 768px, mobile 375px); state matrix (loading/error/empty/retained); data-integrity checksum audit.</w:t>
             </w:r>
           </w:p>
         </w:tc>
@@ -9908,7 +9897,7 @@
           </w:tcPr>
           <w:p>
             <w:r>
-              <w:t>FastAPI TestClient integration tests; end-to-end browser walkthrough; non-color-only accessibility verification; independent validator verification on displayed candidate allocations.</w:t>
+              <w:t>FastAPI TestClient integration tests; end-to-end browser walkthrough; visual inspection against Image 2 benchmark; non-color-only accessibility verification; independent validator verification on displayed candidate allocations.</w:t>
             </w:r>
           </w:p>
         </w:tc>
@@ -9959,7 +9948,7 @@
           </w:tcPr>
           <w:p>
             <w:r>
-              <w:t>Every UI view functional and truthfully wired to backend models; odd-cycle baseline fallback explicitly explained in UI; M601 saturation infeasibility diagnosed; atomic rollback verified; 0 new npm packages; 100% test pass rate across backend and API tests.</w:t>
+              <w:t>Every UI view functional and truthfully wired to backend models; visual hierarchy aligned with Image 2; odd-cycle baseline fallback explicitly explained in UI; M601 saturation infeasibility diagnosed; atomic rollback verified; 0 new npm packages; 100% test pass rate across backend and API tests.</w:t>
             </w:r>
           </w:p>
         </w:tc>
@@ -22496,7 +22485,7 @@
           </w:tcPr>
           <w:p>
             <w:r>
-              <w:t>CIQ-PLAN-005 v0.2.4; ADR-001 (FastAPI Backend Architecture); ADR-002 (Modern Zero-Build Vanilla SPA Architecture aligned with approved ClassroomIQ UI benchmark); ADR-003 (Truthful Reporting &amp; Baseline Protection Fallback)</w:t>
+              <w:t>CIQ-PLAN-005 v0.2.5; ADR-001 (FastAPI Backend Architecture); ADR-002 (Modern Zero-Build Vanilla SPA Architecture aligned with approved ClassroomIQ UI benchmark Image 2); ADR-003 (Truthful Reporting &amp; Baseline Protection Fallback)</w:t>
             </w:r>
           </w:p>
         </w:tc>
@@ -22584,7 +22573,7 @@
           </w:tcPr>
           <w:p>
             <w:r>
-              <w:t>Branch: feature/phase-p6-optimization-and-simulation; P6 Baseline Commit: 9f6fea2e89f4ce28d7bc9486afefca1252a0760b</w:t>
+              <w:t>Branch: feature/phase-p6-optimization-and-simulation; P6 Baseline Commit: 9f6fea2e89f4ce28d7bc9486afefca1252a0760b; Benchmark Registration Baseline Commit: 0750569</w:t>
             </w:r>
           </w:p>
         </w:tc>
@@ -22650,7 +22639,7 @@
           </w:tcPr>
           <w:p>
             <w:r>
-              <w:t>REQ-DASHBOARD (Operations dashboard &amp; provenance); REQ-SPATIAL (Timetable grid, room 86/70, cohort, program views); REQ-ALLOC-STUDIO (Optimization execution &amp; baseline comparison); REQ-VALID-INSPECT (Independent validation audit inspector); REQ-DISRUPT-SANDBOX (Disruption simulation: M601 saturation diagnosis, classroom recovery, atomic rollback); REQ-API-BRIDGE (FastAPI REST endpoints with loading, error, empty states); REQ-UI-ALIGN (Responsive design system aligned with approved benchmark).</w:t>
+              <w:t>REQ-BENCHMARK-ALIGN (Visual and layout alignment with approved ClassroomIQ UI benchmark Image 2); REQ-DASHBOARD (Operations dashboard &amp; data source provenance); REQ-SPATIAL (Timetable grid: Odd 680 / Even 570 sessions, 5 programs, 45 cohorts, 86 rooms inventory; no unverified department filter); REQ-ALLOC-STUDIO (Optimization execution &amp; baseline comparison: Even 60.52% synthetic proxy reduction; Odd baseline retained at 1,248.0 min); REQ-VALID-INSPECT (Independent validation audit inspector: factual capacity gap labeling); REQ-DISRUPT-SANDBOX (Disruption simulation: M601 saturation diagnosis, classroom recovery, atomic rollback); REQ-API-BRIDGE (FastAPI REST endpoints with loading, error, empty states).</w:t>
             </w:r>
           </w:p>
         </w:tc>
@@ -22672,7 +22661,7 @@
           </w:tcPr>
           <w:p>
             <w:r>
-              <w:t>Backend API Layer: backend/app/main.py, backend/app/api/__init__.py, backend/app/api/status.py, backend/app/api/inventory.py, backend/app/api/allocation.py, backend/app/api/validation.py, backend/app/api/simulation.py. Backend Tests: backend/tests/test_api.py. Frontend Static Files: frontend/index.html, frontend/css/styles.css, frontend/js/api.js, frontend/js/components/*.js, frontend/assets/*. Documentation: docs/ClassroomIQ_Document_05_Implementation_Roadmap_and_Build_Authorization_v0.2.0.docx. STRICT PROHIBITION: No edits to data/*.csv; no rewriting P4–P6 core algorithms.</w:t>
+              <w:t>Backend API Layer: backend/app/main.py, backend/app/api/__init__.py, backend/app/api/status.py, backend/app/api/inventory.py, backend/app/api/allocation.py, backend/app/api/validation.py, backend/app/api/simulation.py. Backend Tests: backend/tests/test_api.py. Frontend Static Files: frontend/index.html, frontend/css/styles.css, frontend/js/api.js, frontend/js/components/*.js, frontend/assets/*. Documentation: docs/ClassroomIQ_Document_05_Implementation_Roadmap_and_Build_Authorization_v0.2.0.docx, docs/ClassroomIQ_UI_Benchmark_Approved_Reference.jpg. STRICT PROHIBITION: No edits to data/*.csv; no rewriting P4–P6 core algorithms.</w:t>
             </w:r>
           </w:p>
         </w:tc>
@@ -22694,7 +22683,7 @@
           </w:tcPr>
           <w:p>
             <w:r>
-              <w:t>Strictly forbidden: modifying original CSVs in data/; treating benchmark as a data source; inventing room allocations, enrollments, capacities, or facilities; blurring 86 physical rooms vs 70 confirmed active rooms; representing unknown/synthetic data as verified facts; omitting baseline fallback when candidate does not beat baseline; describing synthetic travel proxies as measured walking times; rewriting P4–P6 algorithms to simplify UI integration; color-only status badges; inert clickable controls without working handlers or disabled states.</w:t>
+              <w:t>Strictly forbidden: modifying original CSVs in data/; treating benchmark timetable cells as a data source (mock cells like CS101, EE101 are illustrative); inventing room allocations, enrollments, capacities, departments, or facilities; claiming 70 rooms active without evidence (inventory is 86 rooms); presenting department filtering as factual without a documented mapping; representing unknown/synthetic data as verified facts; omitting baseline fallback when candidate does not beat baseline; describing synthetic travel proxies as measured walking times; rewriting P4–P6 algorithms to simplify UI integration; color-only status badges; inert clickable controls without working handlers or disabled states.</w:t>
             </w:r>
           </w:p>
         </w:tc>
@@ -22738,7 +22727,7 @@
           </w:tcPr>
           <w:p>
             <w:r>
-              <w:t>Factual Mode: Read directly from validated CSV models; capacity status explicitly exposed as INSUFFICIENT_EVIDENCE (Data Gap). Synthetic Evaluation Profile: Explicitly labeled toggle in UI providing scenario demonstrations with clear synthetic assumptions banner. 7 source CSVs: Immutable seed datasets.</w:t>
+              <w:t>Factual Mode: Read directly from validated CSV models (Odd: 680 sessions, Even: 570 sessions, 5 programs, 45 cohorts, 86 rooms inventory); capacity and student demand status explicitly exposed as INSUFFICIENT_EVIDENCE (Data Gap). Synthetic Evaluation Profile: Explicitly labeled toggle in UI providing scenario demonstrations with clear synthetic assumptions banner. UI Benchmark (Image 2): Layout, hierarchy, and navigation reference; all cell values illustrative. 7 source CSVs: Immutable seed datasets.</w:t>
             </w:r>
           </w:p>
         </w:tc>
@@ -22782,7 +22771,7 @@
           </w:tcPr>
           <w:p>
             <w:r>
-              <w:t>All 45 existing core tests + all new API integration tests pass; API responds with HTTP 200 and schema-conforming payloads across all defined endpoints; Dashboard displays verified source provenance and row counts; Timetable grid renders sessions for Odd (593) and Even (570) cycles without crashing; Room catalog displays 86 physical rooms and flags the 16 rooms lacking confirmed availability; Allocation comparison displays genuine 60.52% walking-time reduction on Even cycle, and truthfully displays retained baseline with 0.0 min reduction and time-limited status on Odd cycle; Validation inspector displays zero double-bookings, zero cohort clashes, flags 10 computing lab sessions, and identifies missing capacity data in Factual Mode; Disruption simulation truthfully displays infeasible_repair with campus-wide lab saturation for M601, successful repair for classroom events and synthetic closure, and 100% atomic state restoration upon rollback; Complete state handling: skeleton loaders during solver runs, error banners, accessible non-color-only badges.</w:t>
+              <w:t>All 45 existing core tests + all new API integration tests pass; API responds with HTTP 200 and schema-conforming payloads; Dashboard displays verified source provenance and row counts (Odd: 680, Even: 570, Programs: 5, Cohorts: 45, Rooms: 86); Timetable grid renders sessions for Odd (680) and Even (570) cycles without crashing; Room catalog displays 86 physical rooms and preserves unverified availability status as Unknown; Allocation comparison displays genuine 60.52% synthetic walking-time proxy reduction on Even cycle, and truthfully displays retained baseline (1,248.0 min, raw candidate 1,286.0 min rejected) with time-limited status on Odd cycle; Validation inspector displays zero double-bookings, zero cohort clashes, flags 10 computing lab sessions, and identifies missing capacity data in Factual Mode; Disruption simulation truthfully displays infeasible_repair with campus-wide lab saturation for M601 (20 concurrent lab sessions vs 19 available lab rooms), successful repair for classroom events and synthetic closure, and 100% atomic state restoration upon rollback; Visual alignment with approved benchmark Image 2; Complete state handling: skeleton loaders, error banners, non-color-only badges.</w:t>
             </w:r>
           </w:p>
         </w:tc>
@@ -25865,6 +25854,48 @@
           </w:p>
         </w:tc>
       </w:tr>
+      <w:tr>
+        <w:tc>
+          <w:tcPr>
+            <w:tcW w:type="dxa" w:w="2459"/>
+          </w:tcPr>
+          <w:p>
+            <w:r>
+              <w:t>0.2.5</w:t>
+            </w:r>
+          </w:p>
+        </w:tc>
+        <w:tc>
+          <w:tcPr>
+            <w:tcW w:type="dxa" w:w="2459"/>
+          </w:tcPr>
+          <w:p>
+            <w:r>
+              <w:t>2026-10-10</w:t>
+            </w:r>
+          </w:p>
+        </w:tc>
+        <w:tc>
+          <w:tcPr>
+            <w:tcW w:type="dxa" w:w="2459"/>
+          </w:tcPr>
+          <w:p>
+            <w:r>
+              <w:t>Phase P7 Benchmark Registration &amp; Scope Realignment: (1) Formally registered approved ClassroomIQ UI benchmark (Image 2 / docs/ClassroomIQ_UI_Benchmark_Approved_Reference.jpg); (2) Codified benchmark rules: layout, navigation, visual hierarchy, timetable structure, and disruption presentation follow Image 2, while all displayed cells are treated as illustrative mockups and operational values are sourced exclusively from backend models; (3) Reconciled factual data dimensions: Odd cycle = 680 sessions, Even cycle = 570 sessions, 5 distinct programs, 45 unique cohorts, and 86-room physical inventory (removing unsupported claims regarding 70 rooms or department filtering); (4) Reaffirmed explicit unknown/insufficient-evidence states for capacity and enrollments; (5) Formally recorded Even-cycle 60.52% synthetic proxy reduction and Odd-cycle baseline retention (1,248.0 min, raw candidate 1,286.0 min rejected); (6) Document 05 advanced to v0.2.5; Phase P7 authorization prepared and ready for owner approval.</w:t>
+            </w:r>
+          </w:p>
+        </w:tc>
+        <w:tc>
+          <w:tcPr>
+            <w:tcW w:type="dxa" w:w="2459"/>
+          </w:tcPr>
+          <w:p>
+            <w:r>
+              <w:t>CONTROLLED DRAFT — PHASE P7 BENCHMARK REGISTERED &amp; AUTHORIZATION READY</w:t>
+            </w:r>
+          </w:p>
+        </w:tc>
+      </w:tr>
     </w:tbl>
     <w:p>
       <w:pPr>
@@ -27283,7 +27314,7 @@
     <w:p>
       <w:pPr/>
       <w:r>
-        <w:t>Phase P6 build authorization is granted under PAR-CIQ-P6-20261009-01 (CIQ-PLAN-005 v0.2.1) and formally accepted at v0.2.3 with documented odd-cycle optimization limitation. Phase P7 build authorization is prepared under PAR-CIQ-P7-20261010-01 (CIQ-PLAN-005 v0.2.4) and pending project owner review and explicit authorization.</w:t>
+        <w:t>Phase P6 build authorization is granted under PAR-CIQ-P6-20261009-01 (CIQ-PLAN-005 v0.2.1) and formally accepted at v0.2.3 with documented odd-cycle optimization limitation. Phase P7 build authorization is prepared and approved visual benchmark (Image 2) is registered under PAR-CIQ-P7-20261010-01 (CIQ-PLAN-005 v0.2.5), pending project owner review and explicit authorization.</w:t>
       </w:r>
     </w:p>
     <w:sectPr>

</xml_diff>

<commit_message>
docs(governance): amend Document 05 to v0.2.6 recording PAR-CIQ-P7-ADDENDUM-01 for upload-first joint allocation
</commit_message>
<xml_diff>
--- a/docs/ClassroomIQ_Document_05_Implementation_Roadmap_and_Build_Authorization_v0.2.0.docx
+++ b/docs/ClassroomIQ_Document_05_Implementation_Roadmap_and_Build_Authorization_v0.2.0.docx
@@ -277,11 +277,8 @@
             <w:shd w:fill="F2F6F9"/>
           </w:tcPr>
           <w:p>
-            <w:pPr>
-              <w:pStyle w:val="TableText"/>
-            </w:pPr>
-            <w:r>
-              <w:t>0.2.5</w:t>
+            <w:r>
+              <w:t>0.2.6</w:t>
             </w:r>
           </w:p>
         </w:tc>
@@ -383,11 +380,8 @@
             <w:shd w:fill="F2F6F9"/>
           </w:tcPr>
           <w:p>
-            <w:pPr>
-              <w:pStyle w:val="TableText"/>
-            </w:pPr>
-            <w:r>
-              <w:t>CONTROLLED DRAFT — P6 ACCEPTED PER PROJECT REPORT; P7 PAR PREPARED; APPROVED UI BENCHMARK REGISTERED; OWNER APPROVAL PENDING</w:t>
+            <w:r>
+              <w:t>AUTHORIZED P7 ADDENDUM — PAR-CIQ-P7-ADDENDUM-01 APPROVED BY OWNER</w:t>
             </w:r>
           </w:p>
         </w:tc>
@@ -541,11 +535,8 @@
             </w:tcMar>
           </w:tcPr>
           <w:p>
-            <w:pPr>
-              <w:pStyle w:val="TableText"/>
-            </w:pPr>
-            <w:r>
-              <w:t>NOT GRANTED — PAR-CIQ-P7-20261010-01 PREPARED ONLY</w:t>
+            <w:r>
+              <w:t>GRANTED — PAR-CIQ-P7-20261010-01 &amp; PAR-CIQ-P7-ADDENDUM-01</w:t>
             </w:r>
           </w:p>
         </w:tc>
@@ -22626,15 +22617,8 @@
             </w:tcBorders>
           </w:tcPr>
           <w:p>
-            <w:pPr>
-              <w:pStyle w:val="TableText"/>
-              <w:spacing w:after="30" w:before="30"/>
-            </w:pPr>
-            <w:r>
-              <w:rPr>
-                <w:sz w:val="16"/>
-              </w:rPr>
-              <w:t>CIQ-PLAN-005 / Document 05 v0.2.5</w:t>
+            <w:r>
+              <w:t>CIQ-PLAN-005 / Document 05 v0.2.6</w:t>
             </w:r>
           </w:p>
         </w:tc>
@@ -24538,6 +24522,38 @@
       </w:r>
     </w:p>
     <w:p>
+      <w:r>
+        <w:t>Mandatory Owner Corrections &amp; Execution Controls:</w:t>
+        <w:br/>
+        <w:t>1. Period Contract Reconciliation: Raw CSV timetable uploads are constrained to periods 1–8 (matching verified availability and sessions datasets). Period 9 remains restricted unless explicit availability evidence is documented.</w:t>
+        <w:br/>
+        <w:t>2. Fresh-Upload Availability Boundary: The assumption that all 86 physical rooms are available for a new timetable is valid strictly within the SYNTHETIC DEMO PROFILE. In Factual Mode, room availability without evidence remains unverified (insufficient evidence).</w:t>
+        <w:br/>
+        <w:t>3. Column Mapping Integrity: Department and Program are distinct concepts. Propose aliases but require explicit user confirmation for ambiguous headers. Never silently map department fields to program.</w:t>
+        <w:br/>
+        <w:t>4. Truthful Infeasibility Diagnostics: Incomplete or infeasible candidates must never be reported as valid. Sessions must never be dropped silently. Return clear diagnostics with affected and conflicting sessions.</w:t>
+        <w:br/>
+        <w:t>5. Phased Milestones: Authorized for sequential implementation across Milestone 1 (Schemas &amp; Upload Service), Milestone 2 (Joint Allocation &amp; Preflight API), Milestone 3 (Export Service), Milestone 4 (Frontend Dropzone &amp; Workflow), and Milestone 5 (Verification &amp; Acceptance).</w:t>
+      </w:r>
+    </w:p>
+    <w:p>
+      <w:r>
+        <w:t>AUTHORIZATION STATE: FORMALLY GRANTED BY PROJECT OWNER (2026-10-10).</w:t>
+        <w:br/>
+        <w:t>RECORD ID: PAR-CIQ-P7-ADDENDUM-01: Upload-First Multi-Timetable Joint Allocation Extension.</w:t>
+        <w:br/>
+        <w:t>GOVERNING REVISION: Document 05 v0.2.6.</w:t>
+      </w:r>
+    </w:p>
+    <w:p>
+      <w:pPr>
+        <w:pStyle w:val="Heading2"/>
+      </w:pPr>
+      <w:r>
+        <w:t>18.3 Approved P7 Phase Authorization Record Addendum — PAR-CIQ-P7-ADDENDUM-01</w:t>
+      </w:r>
+    </w:p>
+    <w:p>
       <w:pPr>
         <w:pStyle w:val="Heading1"/>
       </w:pPr>
@@ -27549,6 +27565,48 @@
           </w:p>
         </w:tc>
       </w:tr>
+      <w:tr>
+        <w:tc>
+          <w:tcPr>
+            <w:tcW w:type="dxa" w:w="2459"/>
+          </w:tcPr>
+          <w:p>
+            <w:r>
+              <w:t>0.2.6</w:t>
+            </w:r>
+          </w:p>
+        </w:tc>
+        <w:tc>
+          <w:tcPr>
+            <w:tcW w:type="dxa" w:w="2459"/>
+          </w:tcPr>
+          <w:p>
+            <w:r>
+              <w:t>2026-10-10</w:t>
+            </w:r>
+          </w:p>
+        </w:tc>
+        <w:tc>
+          <w:tcPr>
+            <w:tcW w:type="dxa" w:w="2459"/>
+          </w:tcPr>
+          <w:p>
+            <w:r>
+              <w:t>Approved PAR-CIQ-P7-ADDENDUM-01: Upload-First Multi-Timetable Joint Allocation Extension. Reconciled 1–8 input periods with 9-period frontend (periods 1–8 for raw CSV upload unless explicit period-9 rule documented). Established fresh-upload availability as a Synthetic Demo Profile assumption only (factual mode preserves insufficient evidence). Mandated user confirmation for ambiguous Department/Program mappings. Prohibited silent session drops on infeasibility, requiring explicit diagnostics. Authorized Milestone 1–5 sequential execution.</w:t>
+            </w:r>
+          </w:p>
+        </w:tc>
+        <w:tc>
+          <w:tcPr>
+            <w:tcW w:type="dxa" w:w="2459"/>
+          </w:tcPr>
+          <w:p>
+            <w:r>
+              <w:t>AUTHORIZED P7 ADDENDUM EXECUTION</w:t>
+            </w:r>
+          </w:p>
+        </w:tc>
+      </w:tr>
     </w:tbl>
     <w:p>
       <w:pPr>
@@ -27782,11 +27840,8 @@
             </w:tcMar>
           </w:tcPr>
           <w:p>
-            <w:pPr>
-              <w:pStyle w:val="TableText"/>
-            </w:pPr>
-            <w:r>
-              <w:t>PREPARED — v0.2.5</w:t>
+            <w:r>
+              <w:t>PREPARED — v0.2.6</w:t>
             </w:r>
           </w:p>
         </w:tc>

</xml_diff>

<commit_message>
docs(governance): record formal acceptance and closure of Phase P7 in Document 05 v0.2.7
</commit_message>
<xml_diff>
--- a/docs/ClassroomIQ_Document_05_Implementation_Roadmap_and_Build_Authorization_v0.2.0.docx
+++ b/docs/ClassroomIQ_Document_05_Implementation_Roadmap_and_Build_Authorization_v0.2.0.docx
@@ -65,24 +65,9 @@
             </w:tcMar>
           </w:tcPr>
           <w:p>
-            <w:pPr>
-              <w:spacing w:after="60"/>
-            </w:pPr>
-            <w:r>
-              <w:rPr>
-                <w:b/>
-                <w:color w:val="C00000"/>
-              </w:rPr>
-              <w:t>CONTROLLING STATUS — P7 AUTHORIZATION PREPARED; STOP GATE ACTIVE</w:t>
-              <w:br/>
-              <w:t>CONTROLLED DRAFT — P4–P6 are recorded as accepted in the project reports; P6 baseline commit 9f6fea2 is report-referenced. The P7 Phase Authorization Record PAR-CIQ-P7-20261010-01 is prepared but not granted. The owner-approved Image 2 is registered at docs/ClassroomIQ_UI_Benchmark_Approved_Reference.jpg and is a visual/UX reference only. Explicit owner approval is required before any frontend/API implementation, scaffolding, source mutation or dependency installation. Source-data reconciliation guards remain binding.</w:t>
-            </w:r>
-          </w:p>
-          <w:p>
-            <w:pPr>
-              <w:spacing w:after="0" w:line="240" w:lineRule="auto"/>
-            </w:pPr>
-            <w:r/>
+            <w:r>
+              <w:t>CONTROLLING STATUS — PHASE P7 FORMALLY ACCEPTED AND CLOSED. Phase P7 (Frontend Integration &amp; Upload-First Multi-Timetable Joint Allocation) is fully verified, owner-confirmed, and closed per formal acceptance record. All 103 backend automated tests pass. All seven original seed datasets in data/ match baseline commit 9f6fea2 bit-for-bit. Core optimization and simulation algorithms from P4–P6 remain intact without modification. Demonstrations rely on documented Synthetic Demo Profile assumptions for room capacity and physical availability; in-memory upload runs are ephemeral and do not persist across server restarts. P8 Benchmarking and P9 Presentation work remain gated pending separate build authorization.</w:t>
+            </w:r>
           </w:p>
         </w:tc>
       </w:tr>
@@ -278,7 +263,7 @@
           </w:tcPr>
           <w:p>
             <w:r>
-              <w:t>0.2.6</w:t>
+              <w:t>0.2.7</w:t>
             </w:r>
           </w:p>
         </w:tc>
@@ -381,7 +366,7 @@
           </w:tcPr>
           <w:p>
             <w:r>
-              <w:t>AUTHORIZED P7 ADDENDUM — PAR-CIQ-P7-ADDENDUM-01 APPROVED BY OWNER</w:t>
+              <w:t>PHASE P7 FORMALLY ACCEPTED AND CLOSED — PAR-CIQ-P7-20261010-01 &amp; PAR-CIQ-P7-ADDENDUM-01</w:t>
             </w:r>
           </w:p>
         </w:tc>
@@ -536,7 +521,7 @@
           </w:tcPr>
           <w:p>
             <w:r>
-              <w:t>GRANTED — PAR-CIQ-P7-20261010-01 &amp; PAR-CIQ-P7-ADDENDUM-01</w:t>
+              <w:t>COMPLETED &amp; CLOSED — PAR-CIQ-P7-20261010-01 &amp; PAR-CIQ-P7-ADDENDUM-01</w:t>
             </w:r>
           </w:p>
         </w:tc>
@@ -692,11 +677,8 @@
             <w:shd w:fill="F2F6F9"/>
           </w:tcPr>
           <w:p>
-            <w:pPr>
-              <w:pStyle w:val="TableText"/>
-            </w:pPr>
-            <w:r>
-              <w:t>Project owner/team; this revision prepares but does not grant P7 authorization</w:t>
+            <w:r>
+              <w:t>Project owner/team; P7 accepted per owner-confirmed browser verification and 103 passing automated tests</w:t>
             </w:r>
           </w:p>
         </w:tc>
@@ -3106,19 +3088,8 @@
             </w:tcMar>
           </w:tcPr>
           <w:p>
-            <w:pPr>
-              <w:spacing w:after="60"/>
-            </w:pPr>
-            <w:r>
-              <w:t>READINESS CONCLUSION — P7 AUTHORIZATION PREPARED, NOT GRANTED</w:t>
-            </w:r>
-          </w:p>
-          <w:p>
-            <w:pPr>
-              <w:spacing w:after="0" w:line="240" w:lineRule="auto"/>
-            </w:pPr>
-            <w:r>
-              <w:t>The project has a reported accepted P4–P6 baseline and a prepared P7 Phase Authorization Record. The next action is owner review and explicit grant/deny/defer. No frontend implementation or REST route creation may begin before that decision. Known source-data contradictions and unsupported fields must remain visible as guardrails; see Section 18.2.</w:t>
+            <w:r>
+              <w:t>READINESS CONCLUSION — PHASE P7 ACCEPTED AND CLOSED. Phase P7 has satisfied all technical acceptance criteria and owner-confirmed UI verification gates. Milestones 1–5, Addendum-01, and the All Days weekly view correction are verified. P8 and P9 remain gated and require separate authorization before work begins.</w:t>
             </w:r>
           </w:p>
         </w:tc>
@@ -7889,17 +7860,8 @@
             </w:tcMar>
           </w:tcPr>
           <w:p>
-            <w:pPr>
-              <w:spacing w:after="60"/>
-            </w:pPr>
-            <w:r>
-              <w:rPr>
-                <w:b/>
-                <w:color w:val="C00000"/>
-              </w:rPr>
-              <w:t>PHASE STATUS — P4–P6 REPORTED ACCEPTED; P7 PREPARED, NOT AUTHORIZED</w:t>
-              <w:br/>
-              <w:t>P4–P6 acceptance is recorded from the project reports. P7 is the next proposed phase, but PAR-CIQ-P7-20261010-01 remains pending explicit owner approval. P8–P9 remain future gated work. No implementation, source edits, dependencies or environment changes are authorized until the owner records GRANT for the named phase.</w:t>
+            <w:r>
+              <w:t>PHASE STATUS — P4–P7 FORMALLY ACCEPTED AND CLOSED. P7 acceptance is recorded following complete implementation, 103 passing tests, bit-for-bit dataset integrity, and owner-confirmed manual browser verification. P8–P9 remain future gated work.</w:t>
             </w:r>
           </w:p>
         </w:tc>
@@ -22560,15 +22522,8 @@
             <w:shd w:fill="F2F6FA"/>
           </w:tcPr>
           <w:p>
-            <w:pPr>
-              <w:pStyle w:val="TableText"/>
-              <w:spacing w:after="30" w:before="30"/>
-            </w:pPr>
-            <w:r>
-              <w:rPr>
-                <w:sz w:val="16"/>
-              </w:rPr>
-              <w:t>P7 — Frontend Integration, REST API Bridge &amp; UI Benchmark Realization</w:t>
+            <w:r>
+              <w:t>CIQ-PLAN-005 / Document 05 v0.2.7</w:t>
             </w:r>
           </w:p>
         </w:tc>
@@ -22618,7 +22573,7 @@
           </w:tcPr>
           <w:p>
             <w:r>
-              <w:t>CIQ-PLAN-005 / Document 05 v0.2.6</w:t>
+              <w:t>GRANTED, EXECUTED, AND FORMALLY ACCEPTED</w:t>
             </w:r>
           </w:p>
         </w:tc>
@@ -24691,18 +24646,8 @@
             </w:tcMar>
           </w:tcPr>
           <w:p>
-            <w:pPr>
-              <w:pStyle w:val="TableText"/>
-            </w:pPr>
-            <w:r/>
-            <w:r>
-              <w:rPr>
-                <w:rFonts w:ascii="Aptos" w:hAnsi="Aptos"/>
-                <w:b w:val="0"/>
-                <w:color w:val="17242E"/>
-                <w:sz w:val="14"/>
-              </w:rPr>
-              <w:t>[PENDING]</w:t>
+            <w:r>
+              <w:t>PAR-CIQ-P7-20261010-01 &amp; PAR-CIQ-P7-ADDENDUM-01</w:t>
             </w:r>
           </w:p>
         </w:tc>
@@ -24752,18 +24697,8 @@
             <w:shd w:fill="F2F6F9"/>
           </w:tcPr>
           <w:p>
-            <w:pPr>
-              <w:pStyle w:val="TableText"/>
-            </w:pPr>
-            <w:r/>
-            <w:r>
-              <w:rPr>
-                <w:rFonts w:ascii="Aptos" w:hAnsi="Aptos"/>
-                <w:b w:val="0"/>
-                <w:color w:val="17242E"/>
-                <w:sz w:val="14"/>
-              </w:rPr>
-              <w:t>[PENDING]</w:t>
+            <w:r>
+              <w:t>9f6fea2</w:t>
             </w:r>
           </w:p>
         </w:tc>
@@ -24811,18 +24746,8 @@
             </w:tcMar>
           </w:tcPr>
           <w:p>
-            <w:pPr>
-              <w:pStyle w:val="TableText"/>
-            </w:pPr>
-            <w:r/>
-            <w:r>
-              <w:rPr>
-                <w:rFonts w:ascii="Aptos" w:hAnsi="Aptos"/>
-                <w:b w:val="0"/>
-                <w:color w:val="17242E"/>
-                <w:sz w:val="14"/>
-              </w:rPr>
-              <w:t>[PENDING]</w:t>
+            <w:r>
+              <w:t>b443ce4 (All Days query normalization fix) and governance closure commit</w:t>
             </w:r>
           </w:p>
         </w:tc>
@@ -24872,18 +24797,8 @@
             <w:shd w:fill="F2F6F9"/>
           </w:tcPr>
           <w:p>
-            <w:pPr>
-              <w:pStyle w:val="TableText"/>
-            </w:pPr>
-            <w:r/>
-            <w:r>
-              <w:rPr>
-                <w:rFonts w:ascii="Aptos" w:hAnsi="Aptos"/>
-                <w:b w:val="0"/>
-                <w:color w:val="17242E"/>
-                <w:sz w:val="14"/>
-              </w:rPr>
-              <w:t>[PENDING]</w:t>
+            <w:r>
+              <w:t>Complete P7 Frontend Integration, REST API Bridge, and Upload-First Multi-Timetable Joint Allocation Extension (Milestones 1–5, PAR-CIQ-P7-ADDENDUM-01, All Days weekly view). Full SPA across Operations Dashboard, Academic Timetable Explorer, Allocation Studio, Validation Inspector, Disruption Sandbox, and Step 1–7 Upload-to-Allocate-to-Export workflow.</w:t>
             </w:r>
           </w:p>
         </w:tc>
@@ -24931,18 +24846,8 @@
             </w:tcMar>
           </w:tcPr>
           <w:p>
-            <w:pPr>
-              <w:pStyle w:val="TableText"/>
-            </w:pPr>
-            <w:r/>
-            <w:r>
-              <w:rPr>
-                <w:rFonts w:ascii="Aptos" w:hAnsi="Aptos"/>
-                <w:b w:val="0"/>
-                <w:color w:val="17242E"/>
-                <w:sz w:val="14"/>
-              </w:rPr>
-              <w:t>[PENDING — commands and environment]</w:t>
+            <w:r>
+              <w:t>103 automated tests passed (python -m pytest); 18/18 Milestone 5 end-to-end tests passed; owner-confirmed live UI browser verification.</w:t>
             </w:r>
           </w:p>
         </w:tc>
@@ -24992,18 +24897,8 @@
             <w:shd w:fill="F2F6F9"/>
           </w:tcPr>
           <w:p>
-            <w:pPr>
-              <w:pStyle w:val="TableText"/>
-            </w:pPr>
-            <w:r/>
-            <w:r>
-              <w:rPr>
-                <w:rFonts w:ascii="Aptos" w:hAnsi="Aptos"/>
-                <w:b w:val="0"/>
-                <w:color w:val="17242E"/>
-                <w:sz w:val="14"/>
-              </w:rPr>
-              <w:t>[PENDING]</w:t>
+            <w:r>
+              <w:t>103 passed, 0 failed, 0 skipped. All 7 seed CSVs in data/ match baseline 9f6fea2 bit-for-bit. 5 Semester III branch CSV fixtures verified with 140/140 session placement.</w:t>
             </w:r>
           </w:p>
         </w:tc>
@@ -25051,18 +24946,8 @@
             </w:tcMar>
           </w:tcPr>
           <w:p>
-            <w:pPr>
-              <w:pStyle w:val="TableText"/>
-            </w:pPr>
-            <w:r/>
-            <w:r>
-              <w:rPr>
-                <w:rFonts w:ascii="Aptos" w:hAnsi="Aptos"/>
-                <w:b w:val="0"/>
-                <w:color w:val="17242E"/>
-                <w:sz w:val="14"/>
-              </w:rPr>
-              <w:t>[PENDING — reason and impact]</w:t>
+            <w:r>
+              <w:t>None. (Automated browser driver Playwright download failed with external 404 from Azure CDN; manual UI browser verification was conducted and confirmed by project owner).</w:t>
             </w:r>
           </w:p>
         </w:tc>
@@ -25112,18 +24997,8 @@
             <w:shd w:fill="F2F6F9"/>
           </w:tcPr>
           <w:p>
-            <w:pPr>
-              <w:pStyle w:val="TableText"/>
-            </w:pPr>
-            <w:r/>
-            <w:r>
-              <w:rPr>
-                <w:rFonts w:ascii="Aptos" w:hAnsi="Aptos"/>
-                <w:b w:val="0"/>
-                <w:color w:val="17242E"/>
-                <w:sz w:val="14"/>
-              </w:rPr>
-              <w:t>[PENDING]</w:t>
+            <w:r>
+              <w:t>None for P7 scope. P8 (Performance Benchmarking) and P9 (Demonstration Package) remain deferred to future gated phases.</w:t>
             </w:r>
           </w:p>
         </w:tc>
@@ -25171,18 +25046,8 @@
             </w:tcMar>
           </w:tcPr>
           <w:p>
-            <w:pPr>
-              <w:pStyle w:val="TableText"/>
-            </w:pPr>
-            <w:r/>
-            <w:r>
-              <w:rPr>
-                <w:rFonts w:ascii="Aptos" w:hAnsi="Aptos"/>
-                <w:b w:val="0"/>
-                <w:color w:val="17242E"/>
-                <w:sz w:val="14"/>
-              </w:rPr>
-              <w:t>[PENDING — state none only after review]</w:t>
+            <w:r>
+              <w:t>None. Zero changes to data/*.csv or backend/app/core/*.py.</w:t>
             </w:r>
           </w:p>
         </w:tc>
@@ -25232,18 +25097,8 @@
             <w:shd w:fill="F2F6F9"/>
           </w:tcPr>
           <w:p>
-            <w:pPr>
-              <w:pStyle w:val="TableText"/>
-            </w:pPr>
-            <w:r/>
-            <w:r>
-              <w:rPr>
-                <w:rFonts w:ascii="Aptos" w:hAnsi="Aptos"/>
-                <w:b w:val="0"/>
-                <w:color w:val="17242E"/>
-                <w:sz w:val="14"/>
-              </w:rPr>
-              <w:t>[PENDING]</w:t>
+            <w:r>
+              <w:t>None. Seed datasets verified 100% bit-for-bit against baseline commit 9f6fea2.</w:t>
             </w:r>
           </w:p>
         </w:tc>
@@ -25291,18 +25146,8 @@
             </w:tcMar>
           </w:tcPr>
           <w:p>
-            <w:pPr>
-              <w:pStyle w:val="TableText"/>
-            </w:pPr>
-            <w:r/>
-            <w:r>
-              <w:rPr>
-                <w:rFonts w:ascii="Aptos" w:hAnsi="Aptos"/>
-                <w:b w:val="0"/>
-                <w:color w:val="17242E"/>
-                <w:sz w:val="14"/>
-              </w:rPr>
-              <w:t>[PENDING]</w:t>
+            <w:r>
+              <w:t>None blocking. Documented demonstration assumptions: fresh upload runs use Synthetic Demo Profile room capacities and availability assumptions; in-memory upload run context does not persist across server restarts.</w:t>
             </w:r>
           </w:p>
         </w:tc>
@@ -25352,18 +25197,8 @@
             <w:shd w:fill="F2F6F9"/>
           </w:tcPr>
           <w:p>
-            <w:pPr>
-              <w:pStyle w:val="TableText"/>
-            </w:pPr>
-            <w:r/>
-            <w:r>
-              <w:rPr>
-                <w:rFonts w:ascii="Aptos" w:hAnsi="Aptos"/>
-                <w:b w:val="0"/>
-                <w:color w:val="17242E"/>
-                <w:sz w:val="14"/>
-              </w:rPr>
-              <w:t>[PENDING]</w:t>
+            <w:r>
+              <w:t>Clean Git history on feature/phase-p7-frontend-integration.</w:t>
             </w:r>
           </w:p>
         </w:tc>
@@ -25411,18 +25246,8 @@
             </w:tcMar>
           </w:tcPr>
           <w:p>
-            <w:pPr>
-              <w:pStyle w:val="TableText"/>
-            </w:pPr>
-            <w:r/>
-            <w:r>
-              <w:rPr>
-                <w:rFonts w:ascii="Aptos" w:hAnsi="Aptos"/>
-                <w:b w:val="0"/>
-                <w:color w:val="17242E"/>
-                <w:sz w:val="14"/>
-              </w:rPr>
-              <w:t>[PENDING]</w:t>
+            <w:r>
+              <w:t>Document 05 amended to v0.2.7; P7 Formal Acceptance and Closure Record documented.</w:t>
             </w:r>
           </w:p>
         </w:tc>
@@ -25472,18 +25297,8 @@
             <w:shd w:fill="F2F6F9"/>
           </w:tcPr>
           <w:p>
-            <w:pPr>
-              <w:pStyle w:val="TableText"/>
-            </w:pPr>
-            <w:r/>
-            <w:r>
-              <w:rPr>
-                <w:rFonts w:ascii="Aptos" w:hAnsi="Aptos"/>
-                <w:b w:val="0"/>
-                <w:color w:val="17242E"/>
-                <w:sz w:val="14"/>
-              </w:rPr>
-              <w:t>[PENDING]</w:t>
+            <w:r>
+              <w:t>Owner-confirmed manual browser verification passed; All Days timetable displays complete Monday–Friday schedule in chronological order for Software Systems (28 sessions) and All Programs (140 sessions).</w:t>
             </w:r>
           </w:p>
         </w:tc>
@@ -25531,18 +25346,8 @@
             </w:tcMar>
           </w:tcPr>
           <w:p>
-            <w:pPr>
-              <w:pStyle w:val="TableText"/>
-            </w:pPr>
-            <w:r/>
-            <w:r>
-              <w:rPr>
-                <w:rFonts w:ascii="Aptos" w:hAnsi="Aptos"/>
-                <w:b w:val="0"/>
-                <w:color w:val="17242E"/>
-                <w:sz w:val="14"/>
-              </w:rPr>
-              <w:t>[PENDING]</w:t>
+            <w:r>
+              <w:t>Do not begin P8 or P9 until separate build authorization is granted by project owner.</w:t>
             </w:r>
           </w:p>
         </w:tc>
@@ -25592,17 +25397,8 @@
             <w:shd w:fill="17324D"/>
           </w:tcPr>
           <w:p>
-            <w:pPr>
-              <w:pStyle w:val="TableText"/>
-            </w:pPr>
-            <w:r>
-              <w:rPr>
-                <w:b/>
-                <w:color w:val="C00000"/>
-              </w:rPr>
-              <w:t>STOP GATE — P7 PAR PREPARED, OWNER APPROVAL NOT GRANTED</w:t>
-              <w:br/>
-              <w:t>PAR-CIQ-P7-20261010-01 is a controlled draft only. Do not run the implementation instruction or make application changes until the owner explicitly records GRANT for the exact P7 scope, baseline and mutation surface.</w:t>
+            <w:r>
+              <w:t>GATE DECISION — PHASE P7 FORMALLY ACCEPTED AND CLOSED</w:t>
             </w:r>
           </w:p>
         </w:tc>
@@ -25707,18 +25503,8 @@
             </w:tcMar>
           </w:tcPr>
           <w:p>
-            <w:pPr>
-              <w:pStyle w:val="TableText"/>
-            </w:pPr>
-            <w:r/>
-            <w:r>
-              <w:rPr>
-                <w:rFonts w:ascii="Aptos" w:hAnsi="Aptos"/>
-                <w:b w:val="0"/>
-                <w:color w:val="17242E"/>
-                <w:sz w:val="14"/>
-              </w:rPr>
-              <w:t>ACCEPTED / REJECTED / BLOCKED</w:t>
+            <w:r>
+              <w:t>ACCEPTED AND CLOSED</w:t>
             </w:r>
           </w:p>
         </w:tc>
@@ -25734,18 +25520,8 @@
             </w:tcMar>
           </w:tcPr>
           <w:p>
-            <w:pPr>
-              <w:pStyle w:val="TableText"/>
-            </w:pPr>
-            <w:r/>
-            <w:r>
-              <w:rPr>
-                <w:rFonts w:ascii="Aptos" w:hAnsi="Aptos"/>
-                <w:b w:val="0"/>
-                <w:color w:val="17242E"/>
-                <w:sz w:val="14"/>
-              </w:rPr>
-              <w:t>[PENDING]</w:t>
+            <w:r>
+              <w:t>Project Owner</w:t>
             </w:r>
           </w:p>
         </w:tc>
@@ -25761,18 +25537,8 @@
             </w:tcMar>
           </w:tcPr>
           <w:p>
-            <w:pPr>
-              <w:pStyle w:val="TableText"/>
-            </w:pPr>
-            <w:r/>
-            <w:r>
-              <w:rPr>
-                <w:rFonts w:ascii="Aptos" w:hAnsi="Aptos"/>
-                <w:b w:val="0"/>
-                <w:color w:val="17242E"/>
-                <w:sz w:val="14"/>
-              </w:rPr>
-              <w:t>[PENDING]</w:t>
+            <w:r>
+              <w:t>2026-10-10</w:t>
             </w:r>
           </w:p>
         </w:tc>
@@ -25788,18 +25554,8 @@
             </w:tcMar>
           </w:tcPr>
           <w:p>
-            <w:pPr>
-              <w:pStyle w:val="TableText"/>
-            </w:pPr>
-            <w:r/>
-            <w:r>
-              <w:rPr>
-                <w:rFonts w:ascii="Aptos" w:hAnsi="Aptos"/>
-                <w:b w:val="0"/>
-                <w:color w:val="17242E"/>
-                <w:sz w:val="14"/>
-              </w:rPr>
-              <w:t>[PENDING]</w:t>
+            <w:r>
+              <w:t>Owner-confirmed live UI verification passed; 103/103 tests pass; 7 seed CSVs 100% bit-for-bit unchanged; Document 05 v0.2.7 updated.</w:t>
             </w:r>
           </w:p>
         </w:tc>
@@ -25821,17 +25577,7 @@
             <w:shd w:fill="F2F6F9"/>
           </w:tcPr>
           <w:p>
-            <w:pPr>
-              <w:pStyle w:val="TableText"/>
-            </w:pPr>
-            <w:r/>
-            <w:r>
-              <w:rPr>
-                <w:rFonts w:ascii="Aptos" w:hAnsi="Aptos"/>
-                <w:b w:val="0"/>
-                <w:color w:val="17242E"/>
-                <w:sz w:val="14"/>
-              </w:rPr>
+            <w:r>
               <w:t>Next phase authorization</w:t>
             </w:r>
           </w:p>
@@ -25849,18 +25595,8 @@
             <w:shd w:fill="F2F6F9"/>
           </w:tcPr>
           <w:p>
-            <w:pPr>
-              <w:pStyle w:val="TableText"/>
-            </w:pPr>
-            <w:r/>
-            <w:r>
-              <w:rPr>
-                <w:rFonts w:ascii="Aptos" w:hAnsi="Aptos"/>
-                <w:b w:val="0"/>
-                <w:color w:val="17242E"/>
-                <w:sz w:val="14"/>
-              </w:rPr>
-              <w:t>NOT IMPLIED — create a new Phase Authorization Record</w:t>
+            <w:r>
+              <w:t>NOT IMPLIED — requires separate Phase Authorization Record</w:t>
             </w:r>
           </w:p>
         </w:tc>
@@ -25877,18 +25613,8 @@
             <w:shd w:fill="F2F6F9"/>
           </w:tcPr>
           <w:p>
-            <w:pPr>
-              <w:pStyle w:val="TableText"/>
-            </w:pPr>
-            <w:r/>
-            <w:r>
-              <w:rPr>
-                <w:rFonts w:ascii="Aptos" w:hAnsi="Aptos"/>
-                <w:b w:val="0"/>
-                <w:color w:val="17242E"/>
-                <w:sz w:val="14"/>
-              </w:rPr>
-              <w:t>[N/A]</w:t>
+            <w:r>
+              <w:t>N/A</w:t>
             </w:r>
           </w:p>
         </w:tc>
@@ -25905,18 +25631,8 @@
             <w:shd w:fill="F2F6F9"/>
           </w:tcPr>
           <w:p>
-            <w:pPr>
-              <w:pStyle w:val="TableText"/>
-            </w:pPr>
-            <w:r/>
-            <w:r>
-              <w:rPr>
-                <w:rFonts w:ascii="Aptos" w:hAnsi="Aptos"/>
-                <w:b w:val="0"/>
-                <w:color w:val="17242E"/>
-                <w:sz w:val="14"/>
-              </w:rPr>
-              <w:t>New order required</w:t>
+            <w:r>
+              <w:t>P8/P9 authorization pending separate owner decision</w:t>
             </w:r>
           </w:p>
         </w:tc>
@@ -26862,17 +26578,8 @@
             </w:tcMar>
           </w:tcPr>
           <w:p>
-            <w:pPr>
-              <w:spacing w:after="60"/>
-            </w:pPr>
-            <w:r>
-              <w:rPr>
-                <w:b/>
-                <w:color w:val="C00000"/>
-              </w:rPr>
-              <w:t>STOP GATE — P7 PAR PREPARED, OWNER APPROVAL NOT GRANTED</w:t>
-              <w:br/>
-              <w:t>PAR-CIQ-P7-20261010-01 is a controlled draft only. Do not run the implementation instruction or make application changes until the owner explicitly records GRANT for the exact P7 scope, baseline and mutation surface.</w:t>
+            <w:r>
+              <w:t>GATE STATUS — PHASE P7 ACCEPTED AND CLOSED. No further P7 implementation required.</w:t>
             </w:r>
           </w:p>
         </w:tc>
@@ -27607,6 +27314,48 @@
           </w:p>
         </w:tc>
       </w:tr>
+      <w:tr>
+        <w:tc>
+          <w:tcPr>
+            <w:tcW w:type="dxa" w:w="2459"/>
+          </w:tcPr>
+          <w:p>
+            <w:r>
+              <w:t>0.2.7</w:t>
+            </w:r>
+          </w:p>
+        </w:tc>
+        <w:tc>
+          <w:tcPr>
+            <w:tcW w:type="dxa" w:w="2459"/>
+          </w:tcPr>
+          <w:p>
+            <w:r>
+              <w:t>2026-10-10</w:t>
+            </w:r>
+          </w:p>
+        </w:tc>
+        <w:tc>
+          <w:tcPr>
+            <w:tcW w:type="dxa" w:w="2459"/>
+          </w:tcPr>
+          <w:p>
+            <w:r>
+              <w:t>Formally accepted and closed Phase P7 (Frontend Integration &amp; Upload-First Multi-Timetable Joint Allocation). Successfully implemented and verified Milestones 1–5, the upload-first addendum PAR-CIQ-P7-ADDENDUM-01, and the All Days chronological weekly timetable fix (commit b443ce4). Full test suite passes (103/103 tests). Owner-confirmed live UI browser verification completed. All seven canonical seed CSVs verified 100% bit-for-bit unchanged against baseline commit 9f6fea2. Core P4–P6 optimization algorithms preserved without modification. Recorded demonstration assumptions (synthetic room capacities, synthetic demand profile, in-memory upload run persistence).</w:t>
+            </w:r>
+          </w:p>
+        </w:tc>
+        <w:tc>
+          <w:tcPr>
+            <w:tcW w:type="dxa" w:w="2459"/>
+          </w:tcPr>
+          <w:p>
+            <w:r>
+              <w:t>PHASE P7 FORMALLY ACCEPTED AND CLOSED</w:t>
+            </w:r>
+          </w:p>
+        </w:tc>
+      </w:tr>
     </w:tbl>
     <w:p>
       <w:pPr>
@@ -28859,13 +28608,8 @@
             </w:tcMar>
           </w:tcPr>
           <w:p>
-            <w:pPr>
-              <w:spacing w:after="60"/>
-            </w:pPr>
-            <w:r>
-              <w:t>CURRENT AUTHORIZED ACTION — P7 PAR REVIEW ONLY</w:t>
-              <w:br/>
-              <w:t>This revision authorizes read-only review of Document 05 v0.2.5, the owner-approved UI benchmark and PAR-CIQ-P7-20261010-01. No source edits, frontend/API code, scaffolding, dependency installation, migrations, source-data mutation, publication or deployment is authorized until the owner explicitly grants P7.</w:t>
+            <w:r>
+              <w:t>CURRENT AUTHORIZED ACTION — P7 CLOSURE RECORDED. Implementation of P7 is complete. Future phases P8–P9 remain gated.</w:t>
             </w:r>
           </w:p>
         </w:tc>

</xml_diff>